<commit_message>
exam word docs modifications
</commit_message>
<xml_diff>
--- a/Term 2/Applied Numerical Methods II/FinalExam/examen.docx
+++ b/Term 2/Applied Numerical Methods II/FinalExam/examen.docx
@@ -1,6 +1,6 @@
 
 <file path=word/document.xml><?xml version="1.0" encoding="utf-8"?>
-<w:document xmlns:wpc="http://schemas.microsoft.com/office/word/2010/wordprocessingCanvas" xmlns:cx="http://schemas.microsoft.com/office/drawing/2014/chartex" xmlns:cx1="http://schemas.microsoft.com/office/drawing/2015/9/8/chartex" xmlns:cx2="http://schemas.microsoft.com/office/drawing/2015/10/21/chartex" xmlns:cx3="http://schemas.microsoft.com/office/drawing/2016/5/9/chartex" xmlns:cx4="http://schemas.microsoft.com/office/drawing/2016/5/10/chartex" xmlns:cx5="http://schemas.microsoft.com/office/drawing/2016/5/11/chartex" xmlns:cx6="http://schemas.microsoft.com/office/drawing/2016/5/12/chartex" xmlns:cx7="http://schemas.microsoft.com/office/drawing/2016/5/13/chartex" xmlns:cx8="http://schemas.microsoft.com/office/drawing/2016/5/14/chartex" xmlns:mc="http://schemas.openxmlformats.org/markup-compatibility/2006" xmlns:aink="http://schemas.microsoft.com/office/drawing/2016/ink" xmlns:am3d="http://schemas.microsoft.com/office/drawing/2017/model3d" xmlns:o="urn:schemas-microsoft-com:office:office" xmlns:oel="http://schemas.microsoft.com/office/2019/extlst" xmlns:r="http://schemas.openxmlformats.org/officeDocument/2006/relationships" xmlns:m="http://schemas.openxmlformats.org/officeDocument/2006/math" xmlns:v="urn:schemas-microsoft-com:vml" xmlns:wp14="http://schemas.microsoft.com/office/word/2010/wordprocessingDrawing" xmlns:wp="http://schemas.openxmlformats.org/drawingml/2006/wordprocessingDrawing" xmlns:w10="urn:schemas-microsoft-com:office:word" xmlns:w="http://schemas.openxmlformats.org/wordprocessingml/2006/main" xmlns:w14="http://schemas.microsoft.com/office/word/2010/wordml" xmlns:w15="http://schemas.microsoft.com/office/word/2012/wordml" xmlns:w16cex="http://schemas.microsoft.com/office/word/2018/wordml/cex" xmlns:w16cid="http://schemas.microsoft.com/office/word/2016/wordml/cid" xmlns:w16="http://schemas.microsoft.com/office/word/2018/wordml" xmlns:w16du="http://schemas.microsoft.com/office/word/2023/wordml/word16du" xmlns:w16sdtdh="http://schemas.microsoft.com/office/word/2020/wordml/sdtdatahash" xmlns:w16se="http://schemas.microsoft.com/office/word/2015/wordml/symex" xmlns:wpg="http://schemas.microsoft.com/office/word/2010/wordprocessingGroup" xmlns:wpi="http://schemas.microsoft.com/office/word/2010/wordprocessingInk" xmlns:wne="http://schemas.microsoft.com/office/word/2006/wordml" xmlns:wps="http://schemas.microsoft.com/office/word/2010/wordprocessingShape" mc:Ignorable="w14 w15 w16se w16cid w16 w16cex w16sdtdh w16du wp14">
+<w:document xmlns:wpc="http://schemas.microsoft.com/office/word/2010/wordprocessingCanvas" xmlns:cx="http://schemas.microsoft.com/office/drawing/2014/chartex" xmlns:cx1="http://schemas.microsoft.com/office/drawing/2015/9/8/chartex" xmlns:cx2="http://schemas.microsoft.com/office/drawing/2015/10/21/chartex" xmlns:cx3="http://schemas.microsoft.com/office/drawing/2016/5/9/chartex" xmlns:cx4="http://schemas.microsoft.com/office/drawing/2016/5/10/chartex" xmlns:cx5="http://schemas.microsoft.com/office/drawing/2016/5/11/chartex" xmlns:cx6="http://schemas.microsoft.com/office/drawing/2016/5/12/chartex" xmlns:cx7="http://schemas.microsoft.com/office/drawing/2016/5/13/chartex" xmlns:cx8="http://schemas.microsoft.com/office/drawing/2016/5/14/chartex" xmlns:mc="http://schemas.openxmlformats.org/markup-compatibility/2006" xmlns:aink="http://schemas.microsoft.com/office/drawing/2016/ink" xmlns:am3d="http://schemas.microsoft.com/office/drawing/2017/model3d" xmlns:o="urn:schemas-microsoft-com:office:office" xmlns:oel="http://schemas.microsoft.com/office/2019/extlst" xmlns:r="http://schemas.openxmlformats.org/officeDocument/2006/relationships" xmlns:m="http://schemas.openxmlformats.org/officeDocument/2006/math" xmlns:v="urn:schemas-microsoft-com:vml" xmlns:wp14="http://schemas.microsoft.com/office/word/2010/wordprocessingDrawing" xmlns:wp="http://schemas.openxmlformats.org/drawingml/2006/wordprocessingDrawing" xmlns:w10="urn:schemas-microsoft-com:office:word" xmlns:w="http://schemas.openxmlformats.org/wordprocessingml/2006/main" xmlns:w14="http://schemas.microsoft.com/office/word/2010/wordml" xmlns:w15="http://schemas.microsoft.com/office/word/2012/wordml" xmlns:w16cex="http://schemas.microsoft.com/office/word/2018/wordml/cex" xmlns:w16cid="http://schemas.microsoft.com/office/word/2016/wordml/cid" xmlns:w16="http://schemas.microsoft.com/office/word/2018/wordml" xmlns:w16du="http://schemas.microsoft.com/office/word/2023/wordml/word16du" xmlns:w16sdtdh="http://schemas.microsoft.com/office/word/2020/wordml/sdtdatahash" xmlns:w16sdtfl="http://schemas.microsoft.com/office/word/2024/wordml/sdtformatlock" xmlns:w16se="http://schemas.microsoft.com/office/word/2015/wordml/symex" xmlns:wpg="http://schemas.microsoft.com/office/word/2010/wordprocessingGroup" xmlns:wpi="http://schemas.microsoft.com/office/word/2010/wordprocessingInk" xmlns:wne="http://schemas.microsoft.com/office/word/2006/wordml" xmlns:wps="http://schemas.microsoft.com/office/word/2010/wordprocessingShape" mc:Ignorable="w14 w15 w16se w16cid w16 w16cex w16sdtdh w16sdtfl w16du wp14">
   <w:body>
     <w:tbl>
       <w:tblPr>
@@ -94,7 +94,6 @@
               <w:bottom w:val="single" w:sz="6" w:space="0" w:color="000000"/>
               <w:right w:val="single" w:sz="6" w:space="0" w:color="000000"/>
             </w:tcBorders>
-            <w:shd w:val="clear" w:color="auto" w:fill="auto"/>
             <w:tcMar>
               <w:top w:w="0" w:type="dxa"/>
               <w:left w:w="30" w:type="dxa"/>
@@ -116,7 +115,6 @@
               <w:tc>
                 <w:tcPr>
                   <w:tcW w:w="2500" w:type="pct"/>
-                  <w:shd w:val="clear" w:color="auto" w:fill="auto"/>
                   <w:vAlign w:val="center"/>
                 </w:tcPr>
                 <w:p>
@@ -141,14 +139,13 @@
                       <w:color w:val="808080"/>
                       <w:sz w:val="27"/>
                     </w:rPr>
-                    <w:t>Javier</w:t>
+                    <w:t>xxxxx</w:t>
                   </w:r>
                 </w:p>
               </w:tc>
               <w:tc>
                 <w:tcPr>
                   <w:tcW w:w="0" w:type="auto"/>
-                  <w:shd w:val="clear" w:color="auto" w:fill="auto"/>
                   <w:vAlign w:val="center"/>
                 </w:tcPr>
                 <w:p>
@@ -173,7 +170,7 @@
                       <w:color w:val="808080"/>
                       <w:sz w:val="27"/>
                     </w:rPr>
-                    <w:t>51779264P</w:t>
+                    <w:t>xxxxxx</w:t>
                   </w:r>
                 </w:p>
               </w:tc>
@@ -197,7 +194,6 @@
               <w:bottom w:val="single" w:sz="6" w:space="0" w:color="000000"/>
               <w:right w:val="single" w:sz="6" w:space="0" w:color="000000"/>
             </w:tcBorders>
-            <w:shd w:val="clear" w:color="auto" w:fill="auto"/>
             <w:tcMar>
               <w:top w:w="0" w:type="dxa"/>
               <w:left w:w="30" w:type="dxa"/>
@@ -225,7 +221,6 @@
               <w:bottom w:val="single" w:sz="6" w:space="0" w:color="000000"/>
               <w:right w:val="single" w:sz="6" w:space="0" w:color="000000"/>
             </w:tcBorders>
-            <w:shd w:val="clear" w:color="auto" w:fill="auto"/>
             <w:tcMar>
               <w:top w:w="0" w:type="dxa"/>
               <w:left w:w="30" w:type="dxa"/>
@@ -256,7 +251,25 @@
                 <w:color w:val="808080"/>
                 <w:sz w:val="27"/>
               </w:rPr>
-              <w:t>Blanco Álvarez</w:t>
+              <w:t>xxxxx</w:t>
+            </w:r>
+            <w:r>
+              <w:rPr>
+                <w:rFonts w:ascii="Arial" w:eastAsia="Arial" w:hAnsi="Arial" w:cs="Arial"/>
+                <w:noProof/>
+                <w:color w:val="808080"/>
+                <w:sz w:val="27"/>
+              </w:rPr>
+              <w:t xml:space="preserve"> </w:t>
+            </w:r>
+            <w:r>
+              <w:rPr>
+                <w:rFonts w:ascii="Arial" w:eastAsia="Arial" w:hAnsi="Arial" w:cs="Arial"/>
+                <w:noProof/>
+                <w:color w:val="808080"/>
+                <w:sz w:val="27"/>
+              </w:rPr>
+              <w:t>xxxxxx</w:t>
             </w:r>
           </w:p>
         </w:tc>
@@ -270,7 +283,6 @@
               <w:bottom w:val="single" w:sz="6" w:space="0" w:color="000000"/>
               <w:right w:val="single" w:sz="6" w:space="0" w:color="000000"/>
             </w:tcBorders>
-            <w:shd w:val="clear" w:color="auto" w:fill="auto"/>
             <w:tcMar>
               <w:top w:w="0" w:type="dxa"/>
               <w:left w:w="30" w:type="dxa"/>
@@ -422,7 +434,6 @@
               <w:bottom w:val="single" w:sz="6" w:space="0" w:color="000000"/>
               <w:right w:val="single" w:sz="6" w:space="0" w:color="000000"/>
             </w:tcBorders>
-            <w:shd w:val="clear" w:color="auto" w:fill="auto"/>
             <w:tcMar>
               <w:top w:w="225" w:type="dxa"/>
               <w:left w:w="0" w:type="dxa"/>
@@ -462,7 +473,6 @@
               <w:bottom w:val="single" w:sz="6" w:space="0" w:color="000000"/>
               <w:right w:val="single" w:sz="6" w:space="0" w:color="000000"/>
             </w:tcBorders>
-            <w:shd w:val="clear" w:color="auto" w:fill="auto"/>
             <w:tcMar>
               <w:top w:w="225" w:type="dxa"/>
               <w:left w:w="0" w:type="dxa"/>
@@ -502,7 +512,6 @@
               <w:bottom w:val="single" w:sz="6" w:space="0" w:color="000000"/>
               <w:right w:val="single" w:sz="6" w:space="0" w:color="000000"/>
             </w:tcBorders>
-            <w:shd w:val="clear" w:color="auto" w:fill="auto"/>
             <w:tcMar>
               <w:top w:w="225" w:type="dxa"/>
               <w:left w:w="150" w:type="dxa"/>
@@ -677,7 +686,6 @@
               <w:bottom w:val="single" w:sz="6" w:space="0" w:color="000000"/>
               <w:right w:val="single" w:sz="6" w:space="0" w:color="000000"/>
             </w:tcBorders>
-            <w:shd w:val="clear" w:color="auto" w:fill="auto"/>
             <w:tcMar>
               <w:top w:w="225" w:type="dxa"/>
               <w:left w:w="0" w:type="dxa"/>
@@ -713,7 +721,6 @@
               <w:bottom w:val="single" w:sz="6" w:space="0" w:color="000000"/>
               <w:right w:val="single" w:sz="6" w:space="0" w:color="000000"/>
             </w:tcBorders>
-            <w:shd w:val="clear" w:color="auto" w:fill="auto"/>
             <w:tcMar>
               <w:top w:w="225" w:type="dxa"/>
               <w:left w:w="0" w:type="dxa"/>
@@ -749,7 +756,6 @@
               <w:bottom w:val="single" w:sz="6" w:space="0" w:color="000000"/>
               <w:right w:val="single" w:sz="6" w:space="0" w:color="000000"/>
             </w:tcBorders>
-            <w:shd w:val="clear" w:color="auto" w:fill="auto"/>
             <w:tcMar>
               <w:top w:w="225" w:type="dxa"/>
               <w:left w:w="0" w:type="dxa"/>
@@ -828,7 +834,6 @@
         <w:tc>
           <w:tcPr>
             <w:tcW w:w="100" w:type="auto"/>
-            <w:shd w:val="clear" w:color="auto" w:fill="auto"/>
             <w:vAlign w:val="center"/>
           </w:tcPr>
           <w:p>
@@ -1571,6 +1576,7 @@
           <w:b/>
           <w:bCs/>
           <w:noProof/>
+          <w:lang w:val="es-ES"/>
         </w:rPr>
       </w:pPr>
       <w:r>
@@ -1578,6 +1584,7 @@
           <w:b/>
           <w:bCs/>
           <w:noProof/>
+          <w:lang w:val="es-ES"/>
         </w:rPr>
         <w:t>Tabla:</w:t>
       </w:r>
@@ -1593,6 +1600,7 @@
           <w:noProof/>
           <w:sz w:val="22"/>
           <w:szCs w:val="22"/>
+          <w:lang w:val="es-ES"/>
         </w:rPr>
       </w:pPr>
       <w:r>
@@ -1600,17 +1608,544 @@
           <w:b/>
           <w:bCs/>
           <w:noProof/>
-        </w:rPr>
-        <w:t xml:space="preserve">  </w:t>
-      </w:r>
-      <w:r>
-        <w:rPr>
+          <w:lang w:val="es-ES"/>
+        </w:rPr>
+        <w:t xml:space="preserve">              </w:t>
+      </w:r>
+      <w:r>
+        <w:rPr>
+          <w:rFonts w:ascii="Courier New" w:hAnsi="Courier New" w:cs="Courier New"/>
           <w:b/>
           <w:bCs/>
           <w:noProof/>
-        </w:rPr>
-        <w:t xml:space="preserve">            </w:t>
-      </w:r>
+          <w:sz w:val="22"/>
+          <w:szCs w:val="22"/>
+          <w:lang w:val="es-ES"/>
+        </w:rPr>
+        <w:t>x       Y Newton   dY Newton</w:t>
+      </w:r>
+    </w:p>
+    <w:p>
+      <w:pPr>
+        <w:contextualSpacing/>
+        <w:jc w:val="both"/>
+        <w:rPr>
+          <w:rFonts w:ascii="Courier New" w:hAnsi="Courier New" w:cs="Courier New"/>
+          <w:noProof/>
+          <w:sz w:val="22"/>
+          <w:szCs w:val="22"/>
+          <w:lang w:val="es-ES"/>
+        </w:rPr>
+      </w:pPr>
+      <w:r>
+        <w:rPr>
+          <w:rFonts w:ascii="Courier New" w:hAnsi="Courier New" w:cs="Courier New"/>
+          <w:noProof/>
+          <w:sz w:val="22"/>
+          <w:szCs w:val="22"/>
+          <w:lang w:val="es-ES"/>
+        </w:rPr>
+        <w:t xml:space="preserve">    ______    ________    _________</w:t>
+      </w:r>
+    </w:p>
+    <w:p>
+      <w:pPr>
+        <w:contextualSpacing/>
+        <w:jc w:val="both"/>
+        <w:rPr>
+          <w:rFonts w:ascii="Courier New" w:hAnsi="Courier New" w:cs="Courier New"/>
+          <w:noProof/>
+          <w:sz w:val="22"/>
+          <w:szCs w:val="22"/>
+          <w:lang w:val="es-ES"/>
+        </w:rPr>
+      </w:pPr>
+    </w:p>
+    <w:p>
+      <w:pPr>
+        <w:contextualSpacing/>
+        <w:jc w:val="both"/>
+        <w:rPr>
+          <w:rFonts w:ascii="Courier New" w:hAnsi="Courier New" w:cs="Courier New"/>
+          <w:noProof/>
+          <w:sz w:val="22"/>
+          <w:szCs w:val="22"/>
+          <w:lang w:val="es-ES"/>
+        </w:rPr>
+      </w:pPr>
+      <w:r>
+        <w:rPr>
+          <w:rFonts w:ascii="Courier New" w:hAnsi="Courier New" w:cs="Courier New"/>
+          <w:noProof/>
+          <w:sz w:val="22"/>
+          <w:szCs w:val="22"/>
+          <w:lang w:val="es-ES"/>
+        </w:rPr>
+        <w:t xml:space="preserve">         1          2      -1.9999 </w:t>
+      </w:r>
+    </w:p>
+    <w:p>
+      <w:pPr>
+        <w:contextualSpacing/>
+        <w:jc w:val="both"/>
+        <w:rPr>
+          <w:rFonts w:ascii="Courier New" w:hAnsi="Courier New" w:cs="Courier New"/>
+          <w:noProof/>
+          <w:sz w:val="22"/>
+          <w:szCs w:val="22"/>
+          <w:lang w:val="es-ES"/>
+        </w:rPr>
+      </w:pPr>
+      <w:r>
+        <w:rPr>
+          <w:rFonts w:ascii="Courier New" w:hAnsi="Courier New" w:cs="Courier New"/>
+          <w:noProof/>
+          <w:sz w:val="22"/>
+          <w:szCs w:val="22"/>
+          <w:lang w:val="es-ES"/>
+        </w:rPr>
+        <w:t xml:space="preserve">    1.0526        1.9      -1.8049 </w:t>
+      </w:r>
+    </w:p>
+    <w:p>
+      <w:pPr>
+        <w:contextualSpacing/>
+        <w:jc w:val="both"/>
+        <w:rPr>
+          <w:rFonts w:ascii="Courier New" w:hAnsi="Courier New" w:cs="Courier New"/>
+          <w:noProof/>
+          <w:sz w:val="22"/>
+          <w:szCs w:val="22"/>
+          <w:lang w:val="es-ES"/>
+        </w:rPr>
+      </w:pPr>
+      <w:r>
+        <w:rPr>
+          <w:rFonts w:ascii="Courier New" w:hAnsi="Courier New" w:cs="Courier New"/>
+          <w:noProof/>
+          <w:sz w:val="22"/>
+          <w:szCs w:val="22"/>
+          <w:lang w:val="es-ES"/>
+        </w:rPr>
+        <w:t xml:space="preserve">    1.1053     1.8095      -1.6371 </w:t>
+      </w:r>
+    </w:p>
+    <w:p>
+      <w:pPr>
+        <w:contextualSpacing/>
+        <w:jc w:val="both"/>
+        <w:rPr>
+          <w:rFonts w:ascii="Courier New" w:hAnsi="Courier New" w:cs="Courier New"/>
+          <w:noProof/>
+          <w:sz w:val="22"/>
+          <w:szCs w:val="22"/>
+          <w:lang w:val="es-ES"/>
+        </w:rPr>
+      </w:pPr>
+      <w:r>
+        <w:rPr>
+          <w:rFonts w:ascii="Courier New" w:hAnsi="Courier New" w:cs="Courier New"/>
+          <w:noProof/>
+          <w:sz w:val="22"/>
+          <w:szCs w:val="22"/>
+          <w:lang w:val="es-ES"/>
+        </w:rPr>
+        <w:t xml:space="preserve">    1.1579     1.7273      -1.4916 </w:t>
+      </w:r>
+    </w:p>
+    <w:p>
+      <w:pPr>
+        <w:contextualSpacing/>
+        <w:jc w:val="both"/>
+        <w:rPr>
+          <w:rFonts w:ascii="Courier New" w:hAnsi="Courier New" w:cs="Courier New"/>
+          <w:noProof/>
+          <w:sz w:val="22"/>
+          <w:szCs w:val="22"/>
+          <w:lang w:val="es-ES"/>
+        </w:rPr>
+      </w:pPr>
+      <w:r>
+        <w:rPr>
+          <w:rFonts w:ascii="Courier New" w:hAnsi="Courier New" w:cs="Courier New"/>
+          <w:noProof/>
+          <w:sz w:val="22"/>
+          <w:szCs w:val="22"/>
+          <w:lang w:val="es-ES"/>
+        </w:rPr>
+        <w:t xml:space="preserve">    1.2105     1.6522      -1.3648 </w:t>
+      </w:r>
+    </w:p>
+    <w:p>
+      <w:pPr>
+        <w:contextualSpacing/>
+        <w:jc w:val="both"/>
+        <w:rPr>
+          <w:rFonts w:ascii="Courier New" w:hAnsi="Courier New" w:cs="Courier New"/>
+          <w:noProof/>
+          <w:sz w:val="22"/>
+          <w:szCs w:val="22"/>
+          <w:lang w:val="es-ES"/>
+        </w:rPr>
+      </w:pPr>
+      <w:r>
+        <w:rPr>
+          <w:rFonts w:ascii="Courier New" w:hAnsi="Courier New" w:cs="Courier New"/>
+          <w:noProof/>
+          <w:sz w:val="22"/>
+          <w:szCs w:val="22"/>
+          <w:lang w:val="es-ES"/>
+        </w:rPr>
+        <w:t xml:space="preserve">    1.2632     1.5834      -1.2535 </w:t>
+      </w:r>
+    </w:p>
+    <w:p>
+      <w:pPr>
+        <w:contextualSpacing/>
+        <w:jc w:val="both"/>
+        <w:rPr>
+          <w:rFonts w:ascii="Courier New" w:hAnsi="Courier New" w:cs="Courier New"/>
+          <w:noProof/>
+          <w:sz w:val="22"/>
+          <w:szCs w:val="22"/>
+          <w:lang w:val="es-ES"/>
+        </w:rPr>
+      </w:pPr>
+      <w:r>
+        <w:rPr>
+          <w:rFonts w:ascii="Courier New" w:hAnsi="Courier New" w:cs="Courier New"/>
+          <w:noProof/>
+          <w:sz w:val="22"/>
+          <w:szCs w:val="22"/>
+          <w:lang w:val="es-ES"/>
+        </w:rPr>
+        <w:t xml:space="preserve">    1.3158     1.5201      -1.1553 </w:t>
+      </w:r>
+    </w:p>
+    <w:p>
+      <w:pPr>
+        <w:contextualSpacing/>
+        <w:jc w:val="both"/>
+        <w:rPr>
+          <w:rFonts w:ascii="Courier New" w:hAnsi="Courier New" w:cs="Courier New"/>
+          <w:noProof/>
+          <w:sz w:val="22"/>
+          <w:szCs w:val="22"/>
+          <w:lang w:val="es-ES"/>
+        </w:rPr>
+      </w:pPr>
+      <w:r>
+        <w:rPr>
+          <w:rFonts w:ascii="Courier New" w:hAnsi="Courier New" w:cs="Courier New"/>
+          <w:noProof/>
+          <w:sz w:val="22"/>
+          <w:szCs w:val="22"/>
+          <w:lang w:val="es-ES"/>
+        </w:rPr>
+        <w:t xml:space="preserve">    1.3684     1.4616      -1.0682 </w:t>
+      </w:r>
+    </w:p>
+    <w:p>
+      <w:pPr>
+        <w:contextualSpacing/>
+        <w:jc w:val="both"/>
+        <w:rPr>
+          <w:rFonts w:ascii="Courier New" w:hAnsi="Courier New" w:cs="Courier New"/>
+          <w:noProof/>
+          <w:sz w:val="22"/>
+          <w:szCs w:val="22"/>
+          <w:lang w:val="es-ES"/>
+        </w:rPr>
+      </w:pPr>
+      <w:r>
+        <w:rPr>
+          <w:rFonts w:ascii="Courier New" w:hAnsi="Courier New" w:cs="Courier New"/>
+          <w:noProof/>
+          <w:sz w:val="22"/>
+          <w:szCs w:val="22"/>
+          <w:lang w:val="es-ES"/>
+        </w:rPr>
+        <w:t xml:space="preserve">    1.4211     1.4075     -0.99055 </w:t>
+      </w:r>
+    </w:p>
+    <w:p>
+      <w:pPr>
+        <w:contextualSpacing/>
+        <w:jc w:val="both"/>
+        <w:rPr>
+          <w:rFonts w:ascii="Courier New" w:hAnsi="Courier New" w:cs="Courier New"/>
+          <w:noProof/>
+          <w:sz w:val="22"/>
+          <w:szCs w:val="22"/>
+          <w:lang w:val="es-ES"/>
+        </w:rPr>
+      </w:pPr>
+      <w:r>
+        <w:rPr>
+          <w:rFonts w:ascii="Courier New" w:hAnsi="Courier New" w:cs="Courier New"/>
+          <w:noProof/>
+          <w:sz w:val="22"/>
+          <w:szCs w:val="22"/>
+          <w:lang w:val="es-ES"/>
+        </w:rPr>
+        <w:t xml:space="preserve">    1.4737     1.3572     -0.92108 </w:t>
+      </w:r>
+    </w:p>
+    <w:p>
+      <w:pPr>
+        <w:contextualSpacing/>
+        <w:jc w:val="both"/>
+        <w:rPr>
+          <w:rFonts w:ascii="Courier New" w:hAnsi="Courier New" w:cs="Courier New"/>
+          <w:noProof/>
+          <w:sz w:val="22"/>
+          <w:szCs w:val="22"/>
+          <w:lang w:val="es-ES"/>
+        </w:rPr>
+      </w:pPr>
+      <w:r>
+        <w:rPr>
+          <w:rFonts w:ascii="Courier New" w:hAnsi="Courier New" w:cs="Courier New"/>
+          <w:noProof/>
+          <w:sz w:val="22"/>
+          <w:szCs w:val="22"/>
+          <w:lang w:val="es-ES"/>
+        </w:rPr>
+        <w:t xml:space="preserve">    1.5263     1.3104     -0.85867 </w:t>
+      </w:r>
+    </w:p>
+    <w:p>
+      <w:pPr>
+        <w:contextualSpacing/>
+        <w:jc w:val="both"/>
+        <w:rPr>
+          <w:rFonts w:ascii="Courier New" w:hAnsi="Courier New" w:cs="Courier New"/>
+          <w:noProof/>
+          <w:sz w:val="22"/>
+          <w:szCs w:val="22"/>
+          <w:lang w:val="es-ES"/>
+        </w:rPr>
+      </w:pPr>
+      <w:r>
+        <w:rPr>
+          <w:rFonts w:ascii="Courier New" w:hAnsi="Courier New" w:cs="Courier New"/>
+          <w:noProof/>
+          <w:sz w:val="22"/>
+          <w:szCs w:val="22"/>
+          <w:lang w:val="es-ES"/>
+        </w:rPr>
+        <w:t xml:space="preserve">    1.5789     1.2667     -0.80239 </w:t>
+      </w:r>
+    </w:p>
+    <w:p>
+      <w:pPr>
+        <w:contextualSpacing/>
+        <w:jc w:val="both"/>
+        <w:rPr>
+          <w:rFonts w:ascii="Courier New" w:hAnsi="Courier New" w:cs="Courier New"/>
+          <w:noProof/>
+          <w:sz w:val="22"/>
+          <w:szCs w:val="22"/>
+          <w:lang w:val="es-ES"/>
+        </w:rPr>
+      </w:pPr>
+      <w:r>
+        <w:rPr>
+          <w:rFonts w:ascii="Courier New" w:hAnsi="Courier New" w:cs="Courier New"/>
+          <w:noProof/>
+          <w:sz w:val="22"/>
+          <w:szCs w:val="22"/>
+          <w:lang w:val="es-ES"/>
+        </w:rPr>
+        <w:t xml:space="preserve">    1.6316     1.2259     -0.75146 </w:t>
+      </w:r>
+    </w:p>
+    <w:p>
+      <w:pPr>
+        <w:contextualSpacing/>
+        <w:jc w:val="both"/>
+        <w:rPr>
+          <w:rFonts w:ascii="Courier New" w:hAnsi="Courier New" w:cs="Courier New"/>
+          <w:noProof/>
+          <w:sz w:val="22"/>
+          <w:szCs w:val="22"/>
+          <w:lang w:val="es-ES"/>
+        </w:rPr>
+      </w:pPr>
+      <w:r>
+        <w:rPr>
+          <w:rFonts w:ascii="Courier New" w:hAnsi="Courier New" w:cs="Courier New"/>
+          <w:noProof/>
+          <w:sz w:val="22"/>
+          <w:szCs w:val="22"/>
+          <w:lang w:val="es-ES"/>
+        </w:rPr>
+        <w:t xml:space="preserve">    1.6842     1.1875     -0.70524 </w:t>
+      </w:r>
+    </w:p>
+    <w:p>
+      <w:pPr>
+        <w:contextualSpacing/>
+        <w:jc w:val="both"/>
+        <w:rPr>
+          <w:rFonts w:ascii="Courier New" w:hAnsi="Courier New" w:cs="Courier New"/>
+          <w:noProof/>
+          <w:sz w:val="22"/>
+          <w:szCs w:val="22"/>
+          <w:lang w:val="es-ES"/>
+        </w:rPr>
+      </w:pPr>
+      <w:r>
+        <w:rPr>
+          <w:rFonts w:ascii="Courier New" w:hAnsi="Courier New" w:cs="Courier New"/>
+          <w:noProof/>
+          <w:sz w:val="22"/>
+          <w:szCs w:val="22"/>
+          <w:lang w:val="es-ES"/>
+        </w:rPr>
+        <w:t xml:space="preserve">    1.7368     1.1515     -0.66315 </w:t>
+      </w:r>
+    </w:p>
+    <w:p>
+      <w:pPr>
+        <w:contextualSpacing/>
+        <w:jc w:val="both"/>
+        <w:rPr>
+          <w:rFonts w:ascii="Courier New" w:hAnsi="Courier New" w:cs="Courier New"/>
+          <w:noProof/>
+          <w:sz w:val="22"/>
+          <w:szCs w:val="22"/>
+          <w:lang w:val="es-ES"/>
+        </w:rPr>
+      </w:pPr>
+      <w:r>
+        <w:rPr>
+          <w:rFonts w:ascii="Courier New" w:hAnsi="Courier New" w:cs="Courier New"/>
+          <w:noProof/>
+          <w:sz w:val="22"/>
+          <w:szCs w:val="22"/>
+          <w:lang w:val="es-ES"/>
+        </w:rPr>
+        <w:t xml:space="preserve">    1.7895     1.1177     -0.62472 </w:t>
+      </w:r>
+    </w:p>
+    <w:p>
+      <w:pPr>
+        <w:contextualSpacing/>
+        <w:jc w:val="both"/>
+        <w:rPr>
+          <w:rFonts w:ascii="Courier New" w:hAnsi="Courier New" w:cs="Courier New"/>
+          <w:noProof/>
+          <w:sz w:val="22"/>
+          <w:szCs w:val="22"/>
+          <w:lang w:val="es-ES"/>
+        </w:rPr>
+      </w:pPr>
+      <w:r>
+        <w:rPr>
+          <w:rFonts w:ascii="Courier New" w:hAnsi="Courier New" w:cs="Courier New"/>
+          <w:noProof/>
+          <w:sz w:val="22"/>
+          <w:szCs w:val="22"/>
+          <w:lang w:val="es-ES"/>
+        </w:rPr>
+        <w:t xml:space="preserve">    1.8421     1.0857     -0.58953 </w:t>
+      </w:r>
+    </w:p>
+    <w:p>
+      <w:pPr>
+        <w:contextualSpacing/>
+        <w:jc w:val="both"/>
+        <w:rPr>
+          <w:rFonts w:ascii="Courier New" w:hAnsi="Courier New" w:cs="Courier New"/>
+          <w:noProof/>
+          <w:sz w:val="22"/>
+          <w:szCs w:val="22"/>
+          <w:lang w:val="es-ES"/>
+        </w:rPr>
+      </w:pPr>
+      <w:r>
+        <w:rPr>
+          <w:rFonts w:ascii="Courier New" w:hAnsi="Courier New" w:cs="Courier New"/>
+          <w:noProof/>
+          <w:sz w:val="22"/>
+          <w:szCs w:val="22"/>
+          <w:lang w:val="es-ES"/>
+        </w:rPr>
+        <w:t xml:space="preserve">    1.8947     1.0556     -0.55724 </w:t>
+      </w:r>
+    </w:p>
+    <w:p>
+      <w:pPr>
+        <w:contextualSpacing/>
+        <w:jc w:val="both"/>
+        <w:rPr>
+          <w:rFonts w:ascii="Courier New" w:hAnsi="Courier New" w:cs="Courier New"/>
+          <w:noProof/>
+          <w:sz w:val="22"/>
+          <w:szCs w:val="22"/>
+          <w:lang w:val="es-ES"/>
+        </w:rPr>
+      </w:pPr>
+      <w:r>
+        <w:rPr>
+          <w:rFonts w:ascii="Courier New" w:hAnsi="Courier New" w:cs="Courier New"/>
+          <w:noProof/>
+          <w:sz w:val="22"/>
+          <w:szCs w:val="22"/>
+          <w:lang w:val="es-ES"/>
+        </w:rPr>
+        <w:t xml:space="preserve">    1.9474      1.027     -0.52753 </w:t>
+      </w:r>
+    </w:p>
+    <w:p>
+      <w:pPr>
+        <w:contextualSpacing/>
+        <w:jc w:val="both"/>
+        <w:rPr>
+          <w:rFonts w:ascii="Courier New" w:hAnsi="Courier New" w:cs="Courier New"/>
+          <w:noProof/>
+          <w:sz w:val="22"/>
+          <w:szCs w:val="22"/>
+          <w:lang w:val="es-ES"/>
+        </w:rPr>
+      </w:pPr>
+      <w:r>
+        <w:rPr>
+          <w:rFonts w:ascii="Courier New" w:hAnsi="Courier New" w:cs="Courier New"/>
+          <w:noProof/>
+          <w:sz w:val="22"/>
+          <w:szCs w:val="22"/>
+          <w:lang w:val="es-ES"/>
+        </w:rPr>
+        <w:t xml:space="preserve">         2          1     -0.50013</w:t>
+      </w:r>
+    </w:p>
+    <w:p>
+      <w:pPr>
+        <w:contextualSpacing/>
+        <w:jc w:val="both"/>
+        <w:rPr>
+          <w:rFonts w:ascii="Courier New" w:hAnsi="Courier New" w:cs="Courier New"/>
+          <w:noProof/>
+          <w:sz w:val="22"/>
+          <w:szCs w:val="22"/>
+          <w:lang w:val="es-ES"/>
+        </w:rPr>
+      </w:pPr>
+    </w:p>
+    <w:p>
+      <w:pPr>
+        <w:contextualSpacing/>
+        <w:jc w:val="both"/>
+        <w:rPr>
+          <w:rFonts w:ascii="Courier New" w:hAnsi="Courier New" w:cs="Courier New"/>
+          <w:noProof/>
+          <w:sz w:val="22"/>
+          <w:szCs w:val="22"/>
+          <w:lang w:val="es-ES"/>
+        </w:rPr>
+      </w:pPr>
       <w:r>
         <w:rPr>
           <w:rFonts w:ascii="Courier New" w:hAnsi="Courier New" w:cs="Courier New"/>
@@ -1619,8 +2154,19 @@
           <w:noProof/>
           <w:sz w:val="22"/>
           <w:szCs w:val="22"/>
-        </w:rPr>
-        <w:t>x       Y Newton   dY Newton</w:t>
+          <w:lang w:val="es-ES"/>
+        </w:rPr>
+        <w:t>t=</w:t>
+      </w:r>
+      <w:r>
+        <w:rPr>
+          <w:rFonts w:ascii="Courier New" w:hAnsi="Courier New" w:cs="Courier New"/>
+          <w:noProof/>
+          <w:sz w:val="22"/>
+          <w:szCs w:val="22"/>
+          <w:lang w:val="es-ES"/>
+        </w:rPr>
+        <w:t xml:space="preserve"> -1.999</w:t>
       </w:r>
     </w:p>
     <w:p>
@@ -1632,17 +2178,9 @@
           <w:noProof/>
           <w:sz w:val="22"/>
           <w:szCs w:val="22"/>
-        </w:rPr>
-      </w:pPr>
-      <w:r>
-        <w:rPr>
-          <w:rFonts w:ascii="Courier New" w:hAnsi="Courier New" w:cs="Courier New"/>
-          <w:noProof/>
-          <w:sz w:val="22"/>
-          <w:szCs w:val="22"/>
-        </w:rPr>
-        <w:t xml:space="preserve">    ______    ________    _________</w:t>
-      </w:r>
+          <w:lang w:val="es-ES"/>
+        </w:rPr>
+      </w:pPr>
     </w:p>
     <w:p>
       <w:pPr>
@@ -1653,8 +2191,31 @@
           <w:noProof/>
           <w:sz w:val="22"/>
           <w:szCs w:val="22"/>
-        </w:rPr>
-      </w:pPr>
+          <w:lang w:val="es-ES"/>
+        </w:rPr>
+      </w:pPr>
+      <w:r>
+        <w:rPr>
+          <w:rFonts w:ascii="Courier New" w:hAnsi="Courier New" w:cs="Courier New"/>
+          <w:b/>
+          <w:bCs/>
+          <w:noProof/>
+          <w:sz w:val="22"/>
+          <w:szCs w:val="22"/>
+          <w:lang w:val="es-ES"/>
+        </w:rPr>
+        <w:t>Número de iteraciones</w:t>
+      </w:r>
+      <w:r>
+        <w:rPr>
+          <w:rFonts w:ascii="Courier New" w:hAnsi="Courier New" w:cs="Courier New"/>
+          <w:noProof/>
+          <w:sz w:val="22"/>
+          <w:szCs w:val="22"/>
+          <w:lang w:val="es-ES"/>
+        </w:rPr>
+        <w:t>: 5</w:t>
+      </w:r>
     </w:p>
     <w:p>
       <w:pPr>
@@ -1665,554 +2226,53 @@
           <w:noProof/>
           <w:sz w:val="22"/>
           <w:szCs w:val="22"/>
-        </w:rPr>
-      </w:pPr>
-      <w:r>
-        <w:rPr>
-          <w:rFonts w:ascii="Courier New" w:hAnsi="Courier New" w:cs="Courier New"/>
-          <w:noProof/>
-          <w:sz w:val="22"/>
-          <w:szCs w:val="22"/>
-        </w:rPr>
-        <w:t xml:space="preserve">         1          2      -1.9999 </w:t>
-      </w:r>
-    </w:p>
-    <w:p>
-      <w:pPr>
-        <w:contextualSpacing/>
-        <w:jc w:val="both"/>
-        <w:rPr>
-          <w:rFonts w:ascii="Courier New" w:hAnsi="Courier New" w:cs="Courier New"/>
-          <w:noProof/>
-          <w:sz w:val="22"/>
-          <w:szCs w:val="22"/>
-        </w:rPr>
-      </w:pPr>
-      <w:r>
-        <w:rPr>
-          <w:rFonts w:ascii="Courier New" w:hAnsi="Courier New" w:cs="Courier New"/>
-          <w:noProof/>
-          <w:sz w:val="22"/>
-          <w:szCs w:val="22"/>
-        </w:rPr>
-        <w:t xml:space="preserve">    1.0526        1.9      -1.8049 </w:t>
-      </w:r>
-    </w:p>
-    <w:p>
-      <w:pPr>
-        <w:contextualSpacing/>
-        <w:jc w:val="both"/>
-        <w:rPr>
-          <w:rFonts w:ascii="Courier New" w:hAnsi="Courier New" w:cs="Courier New"/>
-          <w:noProof/>
-          <w:sz w:val="22"/>
-          <w:szCs w:val="22"/>
-        </w:rPr>
-      </w:pPr>
-      <w:r>
-        <w:rPr>
-          <w:rFonts w:ascii="Courier New" w:hAnsi="Courier New" w:cs="Courier New"/>
-          <w:noProof/>
-          <w:sz w:val="22"/>
-          <w:szCs w:val="22"/>
-        </w:rPr>
-        <w:t xml:space="preserve">    1.1053     1.8095      -1.6371 </w:t>
-      </w:r>
-    </w:p>
-    <w:p>
-      <w:pPr>
-        <w:contextualSpacing/>
-        <w:jc w:val="both"/>
-        <w:rPr>
-          <w:rFonts w:ascii="Courier New" w:hAnsi="Courier New" w:cs="Courier New"/>
-          <w:noProof/>
-          <w:sz w:val="22"/>
-          <w:szCs w:val="22"/>
-        </w:rPr>
-      </w:pPr>
-      <w:r>
-        <w:rPr>
-          <w:rFonts w:ascii="Courier New" w:hAnsi="Courier New" w:cs="Courier New"/>
-          <w:noProof/>
-          <w:sz w:val="22"/>
-          <w:szCs w:val="22"/>
-        </w:rPr>
-        <w:t xml:space="preserve">    1.1579     1.7273      -1.4916 </w:t>
-      </w:r>
-    </w:p>
-    <w:p>
-      <w:pPr>
-        <w:contextualSpacing/>
-        <w:jc w:val="both"/>
-        <w:rPr>
-          <w:rFonts w:ascii="Courier New" w:hAnsi="Courier New" w:cs="Courier New"/>
-          <w:noProof/>
-          <w:sz w:val="22"/>
-          <w:szCs w:val="22"/>
-        </w:rPr>
-      </w:pPr>
-      <w:r>
-        <w:rPr>
-          <w:rFonts w:ascii="Courier New" w:hAnsi="Courier New" w:cs="Courier New"/>
-          <w:noProof/>
-          <w:sz w:val="22"/>
-          <w:szCs w:val="22"/>
-        </w:rPr>
-        <w:t xml:space="preserve">    1.2105     1.6522      -1.3648 </w:t>
-      </w:r>
-    </w:p>
-    <w:p>
-      <w:pPr>
-        <w:contextualSpacing/>
-        <w:jc w:val="both"/>
-        <w:rPr>
-          <w:rFonts w:ascii="Courier New" w:hAnsi="Courier New" w:cs="Courier New"/>
-          <w:noProof/>
-          <w:sz w:val="22"/>
-          <w:szCs w:val="22"/>
-        </w:rPr>
-      </w:pPr>
-      <w:r>
-        <w:rPr>
-          <w:rFonts w:ascii="Courier New" w:hAnsi="Courier New" w:cs="Courier New"/>
-          <w:noProof/>
-          <w:sz w:val="22"/>
-          <w:szCs w:val="22"/>
-        </w:rPr>
-        <w:t xml:space="preserve">    1.2632     1.5834      -1.2535 </w:t>
-      </w:r>
-    </w:p>
-    <w:p>
-      <w:pPr>
-        <w:contextualSpacing/>
-        <w:jc w:val="both"/>
-        <w:rPr>
-          <w:rFonts w:ascii="Courier New" w:hAnsi="Courier New" w:cs="Courier New"/>
-          <w:noProof/>
-          <w:sz w:val="22"/>
-          <w:szCs w:val="22"/>
-        </w:rPr>
-      </w:pPr>
-      <w:r>
-        <w:rPr>
-          <w:rFonts w:ascii="Courier New" w:hAnsi="Courier New" w:cs="Courier New"/>
-          <w:noProof/>
-          <w:sz w:val="22"/>
-          <w:szCs w:val="22"/>
-        </w:rPr>
-        <w:t xml:space="preserve">    1.3158     1.5201      -1.1553 </w:t>
-      </w:r>
-    </w:p>
-    <w:p>
-      <w:pPr>
-        <w:contextualSpacing/>
-        <w:jc w:val="both"/>
-        <w:rPr>
-          <w:rFonts w:ascii="Courier New" w:hAnsi="Courier New" w:cs="Courier New"/>
-          <w:noProof/>
-          <w:sz w:val="22"/>
-          <w:szCs w:val="22"/>
-        </w:rPr>
-      </w:pPr>
-      <w:r>
-        <w:rPr>
-          <w:rFonts w:ascii="Courier New" w:hAnsi="Courier New" w:cs="Courier New"/>
-          <w:noProof/>
-          <w:sz w:val="22"/>
-          <w:szCs w:val="22"/>
-        </w:rPr>
-        <w:t xml:space="preserve">    1.3684     1.4616      -1.0682 </w:t>
-      </w:r>
-    </w:p>
-    <w:p>
-      <w:pPr>
-        <w:contextualSpacing/>
-        <w:jc w:val="both"/>
-        <w:rPr>
-          <w:rFonts w:ascii="Courier New" w:hAnsi="Courier New" w:cs="Courier New"/>
-          <w:noProof/>
-          <w:sz w:val="22"/>
-          <w:szCs w:val="22"/>
-        </w:rPr>
-      </w:pPr>
-      <w:r>
-        <w:rPr>
-          <w:rFonts w:ascii="Courier New" w:hAnsi="Courier New" w:cs="Courier New"/>
-          <w:noProof/>
-          <w:sz w:val="22"/>
-          <w:szCs w:val="22"/>
-        </w:rPr>
-        <w:t xml:space="preserve">    1.4211     1.4075     -0.99055 </w:t>
-      </w:r>
-    </w:p>
-    <w:p>
-      <w:pPr>
-        <w:contextualSpacing/>
-        <w:jc w:val="both"/>
-        <w:rPr>
-          <w:rFonts w:ascii="Courier New" w:hAnsi="Courier New" w:cs="Courier New"/>
-          <w:noProof/>
-          <w:sz w:val="22"/>
-          <w:szCs w:val="22"/>
-        </w:rPr>
-      </w:pPr>
-      <w:r>
-        <w:rPr>
-          <w:rFonts w:ascii="Courier New" w:hAnsi="Courier New" w:cs="Courier New"/>
-          <w:noProof/>
-          <w:sz w:val="22"/>
-          <w:szCs w:val="22"/>
-        </w:rPr>
-        <w:t xml:space="preserve">    1.4737     1.3572     -0.92108 </w:t>
-      </w:r>
-    </w:p>
-    <w:p>
-      <w:pPr>
-        <w:contextualSpacing/>
-        <w:jc w:val="both"/>
-        <w:rPr>
-          <w:rFonts w:ascii="Courier New" w:hAnsi="Courier New" w:cs="Courier New"/>
-          <w:noProof/>
-          <w:sz w:val="22"/>
-          <w:szCs w:val="22"/>
-        </w:rPr>
-      </w:pPr>
-      <w:r>
-        <w:rPr>
-          <w:rFonts w:ascii="Courier New" w:hAnsi="Courier New" w:cs="Courier New"/>
-          <w:noProof/>
-          <w:sz w:val="22"/>
-          <w:szCs w:val="22"/>
-        </w:rPr>
-        <w:t xml:space="preserve">    1.5263     1.3104     -0.85867 </w:t>
-      </w:r>
-    </w:p>
-    <w:p>
-      <w:pPr>
-        <w:contextualSpacing/>
-        <w:jc w:val="both"/>
-        <w:rPr>
-          <w:rFonts w:ascii="Courier New" w:hAnsi="Courier New" w:cs="Courier New"/>
-          <w:noProof/>
-          <w:sz w:val="22"/>
-          <w:szCs w:val="22"/>
-        </w:rPr>
-      </w:pPr>
-      <w:r>
-        <w:rPr>
-          <w:rFonts w:ascii="Courier New" w:hAnsi="Courier New" w:cs="Courier New"/>
-          <w:noProof/>
-          <w:sz w:val="22"/>
-          <w:szCs w:val="22"/>
-        </w:rPr>
-        <w:t xml:space="preserve">    1.5789     1.2667     -0.80239 </w:t>
-      </w:r>
-    </w:p>
-    <w:p>
-      <w:pPr>
-        <w:contextualSpacing/>
-        <w:jc w:val="both"/>
-        <w:rPr>
-          <w:rFonts w:ascii="Courier New" w:hAnsi="Courier New" w:cs="Courier New"/>
-          <w:noProof/>
-          <w:sz w:val="22"/>
-          <w:szCs w:val="22"/>
-        </w:rPr>
-      </w:pPr>
-      <w:r>
-        <w:rPr>
-          <w:rFonts w:ascii="Courier New" w:hAnsi="Courier New" w:cs="Courier New"/>
-          <w:noProof/>
-          <w:sz w:val="22"/>
-          <w:szCs w:val="22"/>
-        </w:rPr>
-        <w:t xml:space="preserve">    1.6316     1.2259     -0.75146 </w:t>
-      </w:r>
-    </w:p>
-    <w:p>
-      <w:pPr>
-        <w:contextualSpacing/>
-        <w:jc w:val="both"/>
-        <w:rPr>
-          <w:rFonts w:ascii="Courier New" w:hAnsi="Courier New" w:cs="Courier New"/>
-          <w:noProof/>
-          <w:sz w:val="22"/>
-          <w:szCs w:val="22"/>
-        </w:rPr>
-      </w:pPr>
-      <w:r>
-        <w:rPr>
-          <w:rFonts w:ascii="Courier New" w:hAnsi="Courier New" w:cs="Courier New"/>
-          <w:noProof/>
-          <w:sz w:val="22"/>
-          <w:szCs w:val="22"/>
-        </w:rPr>
-        <w:t xml:space="preserve">    1.6842     1.1875     -0.70524 </w:t>
-      </w:r>
-    </w:p>
-    <w:p>
-      <w:pPr>
-        <w:contextualSpacing/>
-        <w:jc w:val="both"/>
-        <w:rPr>
-          <w:rFonts w:ascii="Courier New" w:hAnsi="Courier New" w:cs="Courier New"/>
-          <w:noProof/>
-          <w:sz w:val="22"/>
-          <w:szCs w:val="22"/>
-        </w:rPr>
-      </w:pPr>
-      <w:r>
-        <w:rPr>
-          <w:rFonts w:ascii="Courier New" w:hAnsi="Courier New" w:cs="Courier New"/>
-          <w:noProof/>
-          <w:sz w:val="22"/>
-          <w:szCs w:val="22"/>
-        </w:rPr>
-        <w:t xml:space="preserve">    1.7368     1.1515     -0.66315 </w:t>
-      </w:r>
-    </w:p>
-    <w:p>
-      <w:pPr>
-        <w:contextualSpacing/>
-        <w:jc w:val="both"/>
-        <w:rPr>
-          <w:rFonts w:ascii="Courier New" w:hAnsi="Courier New" w:cs="Courier New"/>
-          <w:noProof/>
-          <w:sz w:val="22"/>
-          <w:szCs w:val="22"/>
-        </w:rPr>
-      </w:pPr>
-      <w:r>
-        <w:rPr>
-          <w:rFonts w:ascii="Courier New" w:hAnsi="Courier New" w:cs="Courier New"/>
-          <w:noProof/>
-          <w:sz w:val="22"/>
-          <w:szCs w:val="22"/>
-        </w:rPr>
-        <w:t xml:space="preserve">    1.7895     1.1177     -0.62472 </w:t>
-      </w:r>
-    </w:p>
-    <w:p>
-      <w:pPr>
-        <w:contextualSpacing/>
-        <w:jc w:val="both"/>
-        <w:rPr>
-          <w:rFonts w:ascii="Courier New" w:hAnsi="Courier New" w:cs="Courier New"/>
-          <w:noProof/>
-          <w:sz w:val="22"/>
-          <w:szCs w:val="22"/>
-        </w:rPr>
-      </w:pPr>
-      <w:r>
-        <w:rPr>
-          <w:rFonts w:ascii="Courier New" w:hAnsi="Courier New" w:cs="Courier New"/>
-          <w:noProof/>
-          <w:sz w:val="22"/>
-          <w:szCs w:val="22"/>
-        </w:rPr>
-        <w:t xml:space="preserve">    1.8421     1.0857     -0.58953 </w:t>
-      </w:r>
-    </w:p>
-    <w:p>
-      <w:pPr>
-        <w:contextualSpacing/>
-        <w:jc w:val="both"/>
-        <w:rPr>
-          <w:rFonts w:ascii="Courier New" w:hAnsi="Courier New" w:cs="Courier New"/>
-          <w:noProof/>
-          <w:sz w:val="22"/>
-          <w:szCs w:val="22"/>
-        </w:rPr>
-      </w:pPr>
-      <w:r>
-        <w:rPr>
-          <w:rFonts w:ascii="Courier New" w:hAnsi="Courier New" w:cs="Courier New"/>
-          <w:noProof/>
-          <w:sz w:val="22"/>
-          <w:szCs w:val="22"/>
-        </w:rPr>
-        <w:t xml:space="preserve">    1.8947     1.0556     -0.55724 </w:t>
-      </w:r>
-    </w:p>
-    <w:p>
-      <w:pPr>
-        <w:contextualSpacing/>
-        <w:jc w:val="both"/>
-        <w:rPr>
-          <w:rFonts w:ascii="Courier New" w:hAnsi="Courier New" w:cs="Courier New"/>
-          <w:noProof/>
-          <w:sz w:val="22"/>
-          <w:szCs w:val="22"/>
-        </w:rPr>
-      </w:pPr>
-      <w:r>
-        <w:rPr>
-          <w:rFonts w:ascii="Courier New" w:hAnsi="Courier New" w:cs="Courier New"/>
-          <w:noProof/>
-          <w:sz w:val="22"/>
-          <w:szCs w:val="22"/>
-        </w:rPr>
-        <w:t xml:space="preserve">    1.9474      1.027     -0.52753 </w:t>
-      </w:r>
-    </w:p>
-    <w:p>
-      <w:pPr>
-        <w:contextualSpacing/>
-        <w:jc w:val="both"/>
-        <w:rPr>
-          <w:rFonts w:ascii="Courier New" w:hAnsi="Courier New" w:cs="Courier New"/>
-          <w:noProof/>
-          <w:sz w:val="22"/>
-          <w:szCs w:val="22"/>
-        </w:rPr>
-      </w:pPr>
-      <w:r>
-        <w:rPr>
-          <w:rFonts w:ascii="Courier New" w:hAnsi="Courier New" w:cs="Courier New"/>
-          <w:noProof/>
-          <w:sz w:val="22"/>
-          <w:szCs w:val="22"/>
-        </w:rPr>
-        <w:t xml:space="preserve">         2          1     -0.50013</w:t>
-      </w:r>
-    </w:p>
-    <w:p>
-      <w:pPr>
-        <w:contextualSpacing/>
-        <w:jc w:val="both"/>
-        <w:rPr>
-          <w:rFonts w:ascii="Courier New" w:hAnsi="Courier New" w:cs="Courier New"/>
-          <w:noProof/>
-          <w:sz w:val="22"/>
-          <w:szCs w:val="22"/>
-        </w:rPr>
-      </w:pPr>
-    </w:p>
-    <w:p>
-      <w:pPr>
-        <w:contextualSpacing/>
-        <w:jc w:val="both"/>
-        <w:rPr>
-          <w:rFonts w:ascii="Courier New" w:hAnsi="Courier New" w:cs="Courier New"/>
-          <w:noProof/>
-          <w:sz w:val="22"/>
-          <w:szCs w:val="22"/>
-        </w:rPr>
-      </w:pPr>
-      <w:r>
-        <w:rPr>
-          <w:rFonts w:ascii="Courier New" w:hAnsi="Courier New" w:cs="Courier New"/>
-          <w:b/>
-          <w:bCs/>
-          <w:noProof/>
-          <w:sz w:val="22"/>
-          <w:szCs w:val="22"/>
-        </w:rPr>
-        <w:t>t=</w:t>
-      </w:r>
-      <w:r>
-        <w:rPr>
-          <w:rFonts w:ascii="Courier New" w:hAnsi="Courier New" w:cs="Courier New"/>
-          <w:noProof/>
-          <w:sz w:val="22"/>
-          <w:szCs w:val="22"/>
-        </w:rPr>
-        <w:t xml:space="preserve"> -1.999</w:t>
-      </w:r>
-    </w:p>
-    <w:p>
-      <w:pPr>
-        <w:contextualSpacing/>
-        <w:jc w:val="both"/>
-        <w:rPr>
-          <w:rFonts w:ascii="Courier New" w:hAnsi="Courier New" w:cs="Courier New"/>
-          <w:noProof/>
-          <w:sz w:val="22"/>
-          <w:szCs w:val="22"/>
-        </w:rPr>
-      </w:pPr>
-    </w:p>
-    <w:p>
-      <w:pPr>
-        <w:contextualSpacing/>
-        <w:jc w:val="both"/>
-        <w:rPr>
-          <w:rFonts w:ascii="Courier New" w:hAnsi="Courier New" w:cs="Courier New"/>
-          <w:noProof/>
-          <w:sz w:val="22"/>
-          <w:szCs w:val="22"/>
-        </w:rPr>
-      </w:pPr>
-      <w:r>
-        <w:rPr>
-          <w:rFonts w:ascii="Courier New" w:hAnsi="Courier New" w:cs="Courier New"/>
-          <w:b/>
-          <w:bCs/>
-          <w:noProof/>
-          <w:sz w:val="22"/>
-          <w:szCs w:val="22"/>
-        </w:rPr>
-        <w:t>Número de iteraciones</w:t>
-      </w:r>
-      <w:r>
-        <w:rPr>
-          <w:rFonts w:ascii="Courier New" w:hAnsi="Courier New" w:cs="Courier New"/>
-          <w:noProof/>
-          <w:sz w:val="22"/>
-          <w:szCs w:val="22"/>
-        </w:rPr>
-        <w:t>: 5</w:t>
-      </w:r>
-    </w:p>
-    <w:p>
-      <w:pPr>
-        <w:contextualSpacing/>
-        <w:jc w:val="both"/>
-        <w:rPr>
-          <w:rFonts w:ascii="Courier New" w:hAnsi="Courier New" w:cs="Courier New"/>
-          <w:noProof/>
-          <w:sz w:val="22"/>
-          <w:szCs w:val="22"/>
-        </w:rPr>
-      </w:pPr>
-    </w:p>
-    <w:p>
-      <w:pPr>
-        <w:rPr>
-          <w:noProof/>
-        </w:rPr>
-      </w:pPr>
-    </w:p>
-    <w:p>
-      <w:pPr>
-        <w:rPr>
-          <w:noProof/>
-        </w:rPr>
-      </w:pPr>
-    </w:p>
-    <w:p>
-      <w:pPr>
-        <w:rPr>
-          <w:noProof/>
-        </w:rPr>
-      </w:pPr>
-    </w:p>
-    <w:p>
-      <w:pPr>
-        <w:rPr>
-          <w:noProof/>
-        </w:rPr>
-      </w:pPr>
-    </w:p>
-    <w:p>
-      <w:pPr>
-        <w:rPr>
-          <w:noProof/>
-        </w:rPr>
-      </w:pPr>
-      <w:r>
-        <w:rPr>
-          <w:noProof/>
+          <w:lang w:val="es-ES"/>
+        </w:rPr>
+      </w:pPr>
+    </w:p>
+    <w:p>
+      <w:pPr>
+        <w:rPr>
+          <w:noProof/>
+          <w:lang w:val="es-ES"/>
+        </w:rPr>
+      </w:pPr>
+    </w:p>
+    <w:p>
+      <w:pPr>
+        <w:rPr>
+          <w:noProof/>
+          <w:lang w:val="es-ES"/>
+        </w:rPr>
+      </w:pPr>
+    </w:p>
+    <w:p>
+      <w:pPr>
+        <w:rPr>
+          <w:noProof/>
+          <w:lang w:val="es-ES"/>
+        </w:rPr>
+      </w:pPr>
+    </w:p>
+    <w:p>
+      <w:pPr>
+        <w:rPr>
+          <w:noProof/>
+          <w:lang w:val="es-ES"/>
+        </w:rPr>
+      </w:pPr>
+    </w:p>
+    <w:p>
+      <w:pPr>
+        <w:rPr>
+          <w:noProof/>
+          <w:lang w:val="es-ES"/>
+        </w:rPr>
+      </w:pPr>
+      <w:r>
+        <w:rPr>
+          <w:noProof/>
+          <w:lang w:val="es-ES"/>
         </w:rPr>
         <w:lastRenderedPageBreak/>
         <w:t>b) subido como imágenes</w:t>
@@ -2222,25 +2282,29 @@
       <w:pPr>
         <w:rPr>
           <w:noProof/>
-        </w:rPr>
-      </w:pPr>
-    </w:p>
-    <w:p>
-      <w:pPr>
-        <w:rPr>
-          <w:noProof/>
-        </w:rPr>
-      </w:pPr>
-    </w:p>
-    <w:p>
-      <w:pPr>
-        <w:rPr>
-          <w:noProof/>
-        </w:rPr>
-      </w:pPr>
-      <w:r>
-        <w:rPr>
-          <w:noProof/>
+          <w:lang w:val="es-ES"/>
+        </w:rPr>
+      </w:pPr>
+    </w:p>
+    <w:p>
+      <w:pPr>
+        <w:rPr>
+          <w:noProof/>
+          <w:lang w:val="es-ES"/>
+        </w:rPr>
+      </w:pPr>
+    </w:p>
+    <w:p>
+      <w:pPr>
+        <w:rPr>
+          <w:noProof/>
+          <w:lang w:val="es-ES"/>
+        </w:rPr>
+      </w:pPr>
+      <w:r>
+        <w:rPr>
+          <w:noProof/>
+          <w:lang w:val="es-ES"/>
         </w:rPr>
         <w:t>c)</w:t>
       </w:r>
@@ -2250,23 +2314,27 @@
         <w:jc w:val="center"/>
         <w:rPr>
           <w:noProof/>
-        </w:rPr>
-      </w:pPr>
-      <w:r>
-        <w:rPr>
-          <w:noProof/>
+          <w:lang w:val="es-ES"/>
+        </w:rPr>
+      </w:pPr>
+      <w:r>
+        <w:rPr>
+          <w:noProof/>
+          <w:lang w:val="es-ES"/>
         </w:rPr>
         <w:t>Grafica:</w:t>
       </w:r>
       <w:r>
         <w:rPr>
           <w:noProof/>
+          <w:lang w:val="es-ES"/>
         </w:rPr>
         <w:br/>
       </w:r>
       <w:r>
         <w:rPr>
           <w:noProof/>
+          <w:lang w:val="es-ES"/>
         </w:rPr>
         <w:br/>
       </w:r>
@@ -2316,6 +2384,7 @@
         <w:jc w:val="center"/>
         <w:rPr>
           <w:noProof/>
+          <w:lang w:val="es-ES"/>
         </w:rPr>
       </w:pPr>
     </w:p>
@@ -2325,6 +2394,7 @@
           <w:b/>
           <w:bCs/>
           <w:noProof/>
+          <w:lang w:val="es-ES"/>
         </w:rPr>
       </w:pPr>
       <w:r>
@@ -2332,6 +2402,7 @@
           <w:b/>
           <w:bCs/>
           <w:noProof/>
+          <w:lang w:val="es-ES"/>
         </w:rPr>
         <w:t>Tabla:</w:t>
       </w:r>
@@ -2345,6 +2416,7 @@
           <w:noProof/>
           <w:sz w:val="22"/>
           <w:szCs w:val="22"/>
+          <w:lang w:val="es-ES"/>
         </w:rPr>
       </w:pPr>
       <w:r>
@@ -2355,6 +2427,7 @@
           <w:noProof/>
           <w:sz w:val="22"/>
           <w:szCs w:val="22"/>
+          <w:lang w:val="es-ES"/>
         </w:rPr>
         <w:t>Nodos    Solución Y</w:t>
       </w:r>
@@ -2366,14 +2439,16 @@
           <w:noProof/>
           <w:sz w:val="22"/>
           <w:szCs w:val="22"/>
-        </w:rPr>
-      </w:pPr>
-      <w:r>
-        <w:rPr>
-          <w:rFonts w:ascii="Courier New" w:hAnsi="Courier New" w:cs="Courier New"/>
-          <w:noProof/>
-          <w:sz w:val="22"/>
-          <w:szCs w:val="22"/>
+          <w:lang w:val="es-ES"/>
+        </w:rPr>
+      </w:pPr>
+      <w:r>
+        <w:rPr>
+          <w:rFonts w:ascii="Courier New" w:hAnsi="Courier New" w:cs="Courier New"/>
+          <w:noProof/>
+          <w:sz w:val="22"/>
+          <w:szCs w:val="22"/>
+          <w:lang w:val="es-ES"/>
         </w:rPr>
         <w:t>_____    __________</w:t>
       </w:r>
@@ -2385,24 +2460,27 @@
           <w:noProof/>
           <w:sz w:val="22"/>
           <w:szCs w:val="22"/>
-        </w:rPr>
-      </w:pPr>
-    </w:p>
-    <w:p>
-      <w:pPr>
-        <w:rPr>
-          <w:rFonts w:ascii="Courier New" w:hAnsi="Courier New" w:cs="Courier New"/>
-          <w:noProof/>
-          <w:sz w:val="22"/>
-          <w:szCs w:val="22"/>
-        </w:rPr>
-      </w:pPr>
-      <w:r>
-        <w:rPr>
-          <w:rFonts w:ascii="Courier New" w:hAnsi="Courier New" w:cs="Courier New"/>
-          <w:noProof/>
-          <w:sz w:val="22"/>
-          <w:szCs w:val="22"/>
+          <w:lang w:val="es-ES"/>
+        </w:rPr>
+      </w:pPr>
+    </w:p>
+    <w:p>
+      <w:pPr>
+        <w:rPr>
+          <w:rFonts w:ascii="Courier New" w:hAnsi="Courier New" w:cs="Courier New"/>
+          <w:noProof/>
+          <w:sz w:val="22"/>
+          <w:szCs w:val="22"/>
+          <w:lang w:val="es-ES"/>
+        </w:rPr>
+      </w:pPr>
+      <w:r>
+        <w:rPr>
+          <w:rFonts w:ascii="Courier New" w:hAnsi="Courier New" w:cs="Courier New"/>
+          <w:noProof/>
+          <w:sz w:val="22"/>
+          <w:szCs w:val="22"/>
+          <w:lang w:val="es-ES"/>
         </w:rPr>
         <w:t>1       2.3337</w:t>
       </w:r>
@@ -2414,14 +2492,16 @@
           <w:noProof/>
           <w:sz w:val="22"/>
           <w:szCs w:val="22"/>
-        </w:rPr>
-      </w:pPr>
-      <w:r>
-        <w:rPr>
-          <w:rFonts w:ascii="Courier New" w:hAnsi="Courier New" w:cs="Courier New"/>
-          <w:noProof/>
-          <w:sz w:val="22"/>
-          <w:szCs w:val="22"/>
+          <w:lang w:val="es-ES"/>
+        </w:rPr>
+      </w:pPr>
+      <w:r>
+        <w:rPr>
+          <w:rFonts w:ascii="Courier New" w:hAnsi="Courier New" w:cs="Courier New"/>
+          <w:noProof/>
+          <w:sz w:val="22"/>
+          <w:szCs w:val="22"/>
+          <w:lang w:val="es-ES"/>
         </w:rPr>
         <w:t>1.05       2.2238</w:t>
       </w:r>
@@ -2433,14 +2513,16 @@
           <w:noProof/>
           <w:sz w:val="22"/>
           <w:szCs w:val="22"/>
-        </w:rPr>
-      </w:pPr>
-      <w:r>
-        <w:rPr>
-          <w:rFonts w:ascii="Courier New" w:hAnsi="Courier New" w:cs="Courier New"/>
-          <w:noProof/>
-          <w:sz w:val="22"/>
-          <w:szCs w:val="22"/>
+          <w:lang w:val="es-ES"/>
+        </w:rPr>
+      </w:pPr>
+      <w:r>
+        <w:rPr>
+          <w:rFonts w:ascii="Courier New" w:hAnsi="Courier New" w:cs="Courier New"/>
+          <w:noProof/>
+          <w:sz w:val="22"/>
+          <w:szCs w:val="22"/>
+          <w:lang w:val="es-ES"/>
         </w:rPr>
         <w:t>1.1       2.1255</w:t>
       </w:r>
@@ -2452,14 +2534,16 @@
           <w:noProof/>
           <w:sz w:val="22"/>
           <w:szCs w:val="22"/>
-        </w:rPr>
-      </w:pPr>
-      <w:r>
-        <w:rPr>
-          <w:rFonts w:ascii="Courier New" w:hAnsi="Courier New" w:cs="Courier New"/>
-          <w:noProof/>
-          <w:sz w:val="22"/>
-          <w:szCs w:val="22"/>
+          <w:lang w:val="es-ES"/>
+        </w:rPr>
+      </w:pPr>
+      <w:r>
+        <w:rPr>
+          <w:rFonts w:ascii="Courier New" w:hAnsi="Courier New" w:cs="Courier New"/>
+          <w:noProof/>
+          <w:sz w:val="22"/>
+          <w:szCs w:val="22"/>
+          <w:lang w:val="es-ES"/>
         </w:rPr>
         <w:t>1.15       2.0371</w:t>
       </w:r>
@@ -2471,14 +2555,16 @@
           <w:noProof/>
           <w:sz w:val="22"/>
           <w:szCs w:val="22"/>
-        </w:rPr>
-      </w:pPr>
-      <w:r>
-        <w:rPr>
-          <w:rFonts w:ascii="Courier New" w:hAnsi="Courier New" w:cs="Courier New"/>
-          <w:noProof/>
-          <w:sz w:val="22"/>
-          <w:szCs w:val="22"/>
+          <w:lang w:val="es-ES"/>
+        </w:rPr>
+      </w:pPr>
+      <w:r>
+        <w:rPr>
+          <w:rFonts w:ascii="Courier New" w:hAnsi="Courier New" w:cs="Courier New"/>
+          <w:noProof/>
+          <w:sz w:val="22"/>
+          <w:szCs w:val="22"/>
+          <w:lang w:val="es-ES"/>
         </w:rPr>
         <w:t>1.2       1.9573</w:t>
       </w:r>
@@ -2490,14 +2576,16 @@
           <w:noProof/>
           <w:sz w:val="22"/>
           <w:szCs w:val="22"/>
-        </w:rPr>
-      </w:pPr>
-      <w:r>
-        <w:rPr>
-          <w:rFonts w:ascii="Courier New" w:hAnsi="Courier New" w:cs="Courier New"/>
-          <w:noProof/>
-          <w:sz w:val="22"/>
-          <w:szCs w:val="22"/>
+          <w:lang w:val="es-ES"/>
+        </w:rPr>
+      </w:pPr>
+      <w:r>
+        <w:rPr>
+          <w:rFonts w:ascii="Courier New" w:hAnsi="Courier New" w:cs="Courier New"/>
+          <w:noProof/>
+          <w:sz w:val="22"/>
+          <w:szCs w:val="22"/>
+          <w:lang w:val="es-ES"/>
         </w:rPr>
         <w:t>1.25       1.8849</w:t>
       </w:r>
@@ -2509,14 +2597,16 @@
           <w:noProof/>
           <w:sz w:val="22"/>
           <w:szCs w:val="22"/>
-        </w:rPr>
-      </w:pPr>
-      <w:r>
-        <w:rPr>
-          <w:rFonts w:ascii="Courier New" w:hAnsi="Courier New" w:cs="Courier New"/>
-          <w:noProof/>
-          <w:sz w:val="22"/>
-          <w:szCs w:val="22"/>
+          <w:lang w:val="es-ES"/>
+        </w:rPr>
+      </w:pPr>
+      <w:r>
+        <w:rPr>
+          <w:rFonts w:ascii="Courier New" w:hAnsi="Courier New" w:cs="Courier New"/>
+          <w:noProof/>
+          <w:sz w:val="22"/>
+          <w:szCs w:val="22"/>
+          <w:lang w:val="es-ES"/>
         </w:rPr>
         <w:t>1.3       1.8191</w:t>
       </w:r>
@@ -2528,14 +2618,16 @@
           <w:noProof/>
           <w:sz w:val="22"/>
           <w:szCs w:val="22"/>
-        </w:rPr>
-      </w:pPr>
-      <w:r>
-        <w:rPr>
-          <w:rFonts w:ascii="Courier New" w:hAnsi="Courier New" w:cs="Courier New"/>
-          <w:noProof/>
-          <w:sz w:val="22"/>
-          <w:szCs w:val="22"/>
+          <w:lang w:val="es-ES"/>
+        </w:rPr>
+      </w:pPr>
+      <w:r>
+        <w:rPr>
+          <w:rFonts w:ascii="Courier New" w:hAnsi="Courier New" w:cs="Courier New"/>
+          <w:noProof/>
+          <w:sz w:val="22"/>
+          <w:szCs w:val="22"/>
+          <w:lang w:val="es-ES"/>
         </w:rPr>
         <w:t>1.35       1.7589</w:t>
       </w:r>
@@ -2547,14 +2639,16 @@
           <w:noProof/>
           <w:sz w:val="22"/>
           <w:szCs w:val="22"/>
-        </w:rPr>
-      </w:pPr>
-      <w:r>
-        <w:rPr>
-          <w:rFonts w:ascii="Courier New" w:hAnsi="Courier New" w:cs="Courier New"/>
-          <w:noProof/>
-          <w:sz w:val="22"/>
-          <w:szCs w:val="22"/>
+          <w:lang w:val="es-ES"/>
+        </w:rPr>
+      </w:pPr>
+      <w:r>
+        <w:rPr>
+          <w:rFonts w:ascii="Courier New" w:hAnsi="Courier New" w:cs="Courier New"/>
+          <w:noProof/>
+          <w:sz w:val="22"/>
+          <w:szCs w:val="22"/>
+          <w:lang w:val="es-ES"/>
         </w:rPr>
         <w:t>1.4       1.7039</w:t>
       </w:r>
@@ -2566,14 +2660,16 @@
           <w:noProof/>
           <w:sz w:val="22"/>
           <w:szCs w:val="22"/>
-        </w:rPr>
-      </w:pPr>
-      <w:r>
-        <w:rPr>
-          <w:rFonts w:ascii="Courier New" w:hAnsi="Courier New" w:cs="Courier New"/>
-          <w:noProof/>
-          <w:sz w:val="22"/>
-          <w:szCs w:val="22"/>
+          <w:lang w:val="es-ES"/>
+        </w:rPr>
+      </w:pPr>
+      <w:r>
+        <w:rPr>
+          <w:rFonts w:ascii="Courier New" w:hAnsi="Courier New" w:cs="Courier New"/>
+          <w:noProof/>
+          <w:sz w:val="22"/>
+          <w:szCs w:val="22"/>
+          <w:lang w:val="es-ES"/>
         </w:rPr>
         <w:t>1.45       1.6533</w:t>
       </w:r>
@@ -2585,14 +2681,16 @@
           <w:noProof/>
           <w:sz w:val="22"/>
           <w:szCs w:val="22"/>
-        </w:rPr>
-      </w:pPr>
-      <w:r>
-        <w:rPr>
-          <w:rFonts w:ascii="Courier New" w:hAnsi="Courier New" w:cs="Courier New"/>
-          <w:noProof/>
-          <w:sz w:val="22"/>
-          <w:szCs w:val="22"/>
+          <w:lang w:val="es-ES"/>
+        </w:rPr>
+      </w:pPr>
+      <w:r>
+        <w:rPr>
+          <w:rFonts w:ascii="Courier New" w:hAnsi="Courier New" w:cs="Courier New"/>
+          <w:noProof/>
+          <w:sz w:val="22"/>
+          <w:szCs w:val="22"/>
+          <w:lang w:val="es-ES"/>
         </w:rPr>
         <w:t>1.5       1.6068</w:t>
       </w:r>
@@ -2604,14 +2702,16 @@
           <w:noProof/>
           <w:sz w:val="22"/>
           <w:szCs w:val="22"/>
-        </w:rPr>
-      </w:pPr>
-      <w:r>
-        <w:rPr>
-          <w:rFonts w:ascii="Courier New" w:hAnsi="Courier New" w:cs="Courier New"/>
-          <w:noProof/>
-          <w:sz w:val="22"/>
-          <w:szCs w:val="22"/>
+          <w:lang w:val="es-ES"/>
+        </w:rPr>
+      </w:pPr>
+      <w:r>
+        <w:rPr>
+          <w:rFonts w:ascii="Courier New" w:hAnsi="Courier New" w:cs="Courier New"/>
+          <w:noProof/>
+          <w:sz w:val="22"/>
+          <w:szCs w:val="22"/>
+          <w:lang w:val="es-ES"/>
         </w:rPr>
         <w:t>1.55       1.5638</w:t>
       </w:r>
@@ -2623,14 +2723,16 @@
           <w:noProof/>
           <w:sz w:val="22"/>
           <w:szCs w:val="22"/>
-        </w:rPr>
-      </w:pPr>
-      <w:r>
-        <w:rPr>
-          <w:rFonts w:ascii="Courier New" w:hAnsi="Courier New" w:cs="Courier New"/>
-          <w:noProof/>
-          <w:sz w:val="22"/>
-          <w:szCs w:val="22"/>
+          <w:lang w:val="es-ES"/>
+        </w:rPr>
+      </w:pPr>
+      <w:r>
+        <w:rPr>
+          <w:rFonts w:ascii="Courier New" w:hAnsi="Courier New" w:cs="Courier New"/>
+          <w:noProof/>
+          <w:sz w:val="22"/>
+          <w:szCs w:val="22"/>
+          <w:lang w:val="es-ES"/>
         </w:rPr>
         <w:t>1.6       1.5241</w:t>
       </w:r>
@@ -2642,14 +2744,16 @@
           <w:noProof/>
           <w:sz w:val="22"/>
           <w:szCs w:val="22"/>
-        </w:rPr>
-      </w:pPr>
-      <w:r>
-        <w:rPr>
-          <w:rFonts w:ascii="Courier New" w:hAnsi="Courier New" w:cs="Courier New"/>
-          <w:noProof/>
-          <w:sz w:val="22"/>
-          <w:szCs w:val="22"/>
+          <w:lang w:val="es-ES"/>
+        </w:rPr>
+      </w:pPr>
+      <w:r>
+        <w:rPr>
+          <w:rFonts w:ascii="Courier New" w:hAnsi="Courier New" w:cs="Courier New"/>
+          <w:noProof/>
+          <w:sz w:val="22"/>
+          <w:szCs w:val="22"/>
+          <w:lang w:val="es-ES"/>
         </w:rPr>
         <w:t>1.65       1.4873</w:t>
       </w:r>
@@ -2661,14 +2765,16 @@
           <w:noProof/>
           <w:sz w:val="22"/>
           <w:szCs w:val="22"/>
-        </w:rPr>
-      </w:pPr>
-      <w:r>
-        <w:rPr>
-          <w:rFonts w:ascii="Courier New" w:hAnsi="Courier New" w:cs="Courier New"/>
-          <w:noProof/>
-          <w:sz w:val="22"/>
-          <w:szCs w:val="22"/>
+          <w:lang w:val="es-ES"/>
+        </w:rPr>
+      </w:pPr>
+      <w:r>
+        <w:rPr>
+          <w:rFonts w:ascii="Courier New" w:hAnsi="Courier New" w:cs="Courier New"/>
+          <w:noProof/>
+          <w:sz w:val="22"/>
+          <w:szCs w:val="22"/>
+          <w:lang w:val="es-ES"/>
         </w:rPr>
         <w:t>1.7       1.4531</w:t>
       </w:r>
@@ -2680,14 +2786,16 @@
           <w:noProof/>
           <w:sz w:val="22"/>
           <w:szCs w:val="22"/>
-        </w:rPr>
-      </w:pPr>
-      <w:r>
-        <w:rPr>
-          <w:rFonts w:ascii="Courier New" w:hAnsi="Courier New" w:cs="Courier New"/>
-          <w:noProof/>
-          <w:sz w:val="22"/>
-          <w:szCs w:val="22"/>
+          <w:lang w:val="es-ES"/>
+        </w:rPr>
+      </w:pPr>
+      <w:r>
+        <w:rPr>
+          <w:rFonts w:ascii="Courier New" w:hAnsi="Courier New" w:cs="Courier New"/>
+          <w:noProof/>
+          <w:sz w:val="22"/>
+          <w:szCs w:val="22"/>
+          <w:lang w:val="es-ES"/>
         </w:rPr>
         <w:t>1.75       1.4213</w:t>
       </w:r>
@@ -2699,14 +2807,16 @@
           <w:noProof/>
           <w:sz w:val="22"/>
           <w:szCs w:val="22"/>
-        </w:rPr>
-      </w:pPr>
-      <w:r>
-        <w:rPr>
-          <w:rFonts w:ascii="Courier New" w:hAnsi="Courier New" w:cs="Courier New"/>
-          <w:noProof/>
-          <w:sz w:val="22"/>
-          <w:szCs w:val="22"/>
+          <w:lang w:val="es-ES"/>
+        </w:rPr>
+      </w:pPr>
+      <w:r>
+        <w:rPr>
+          <w:rFonts w:ascii="Courier New" w:hAnsi="Courier New" w:cs="Courier New"/>
+          <w:noProof/>
+          <w:sz w:val="22"/>
+          <w:szCs w:val="22"/>
+          <w:lang w:val="es-ES"/>
         </w:rPr>
         <w:t>1.8       1.3918</w:t>
       </w:r>
@@ -2718,14 +2828,16 @@
           <w:noProof/>
           <w:sz w:val="22"/>
           <w:szCs w:val="22"/>
-        </w:rPr>
-      </w:pPr>
-      <w:r>
-        <w:rPr>
-          <w:rFonts w:ascii="Courier New" w:hAnsi="Courier New" w:cs="Courier New"/>
-          <w:noProof/>
-          <w:sz w:val="22"/>
-          <w:szCs w:val="22"/>
+          <w:lang w:val="es-ES"/>
+        </w:rPr>
+      </w:pPr>
+      <w:r>
+        <w:rPr>
+          <w:rFonts w:ascii="Courier New" w:hAnsi="Courier New" w:cs="Courier New"/>
+          <w:noProof/>
+          <w:sz w:val="22"/>
+          <w:szCs w:val="22"/>
+          <w:lang w:val="es-ES"/>
         </w:rPr>
         <w:t>1.85       1.3642</w:t>
       </w:r>
@@ -2737,14 +2849,16 @@
           <w:noProof/>
           <w:sz w:val="22"/>
           <w:szCs w:val="22"/>
-        </w:rPr>
-      </w:pPr>
-      <w:r>
-        <w:rPr>
-          <w:rFonts w:ascii="Courier New" w:hAnsi="Courier New" w:cs="Courier New"/>
-          <w:noProof/>
-          <w:sz w:val="22"/>
-          <w:szCs w:val="22"/>
+          <w:lang w:val="es-ES"/>
+        </w:rPr>
+      </w:pPr>
+      <w:r>
+        <w:rPr>
+          <w:rFonts w:ascii="Courier New" w:hAnsi="Courier New" w:cs="Courier New"/>
+          <w:noProof/>
+          <w:sz w:val="22"/>
+          <w:szCs w:val="22"/>
+          <w:lang w:val="es-ES"/>
         </w:rPr>
         <w:t>1.9       1.3384</w:t>
       </w:r>
@@ -2756,14 +2870,16 @@
           <w:noProof/>
           <w:sz w:val="22"/>
           <w:szCs w:val="22"/>
-        </w:rPr>
-      </w:pPr>
-      <w:r>
-        <w:rPr>
-          <w:rFonts w:ascii="Courier New" w:hAnsi="Courier New" w:cs="Courier New"/>
-          <w:noProof/>
-          <w:sz w:val="22"/>
-          <w:szCs w:val="22"/>
+          <w:lang w:val="es-ES"/>
+        </w:rPr>
+      </w:pPr>
+      <w:r>
+        <w:rPr>
+          <w:rFonts w:ascii="Courier New" w:hAnsi="Courier New" w:cs="Courier New"/>
+          <w:noProof/>
+          <w:sz w:val="22"/>
+          <w:szCs w:val="22"/>
+          <w:lang w:val="es-ES"/>
         </w:rPr>
         <w:t>1.95       1.3143</w:t>
       </w:r>
@@ -2775,14 +2891,16 @@
           <w:noProof/>
           <w:sz w:val="22"/>
           <w:szCs w:val="22"/>
-        </w:rPr>
-      </w:pPr>
-      <w:r>
-        <w:rPr>
-          <w:rFonts w:ascii="Courier New" w:hAnsi="Courier New" w:cs="Courier New"/>
-          <w:noProof/>
-          <w:sz w:val="22"/>
-          <w:szCs w:val="22"/>
+          <w:lang w:val="es-ES"/>
+        </w:rPr>
+      </w:pPr>
+      <w:r>
+        <w:rPr>
+          <w:rFonts w:ascii="Courier New" w:hAnsi="Courier New" w:cs="Courier New"/>
+          <w:noProof/>
+          <w:sz w:val="22"/>
+          <w:szCs w:val="22"/>
+          <w:lang w:val="es-ES"/>
         </w:rPr>
         <w:t>2       1.2917</w:t>
       </w:r>
@@ -3010,7 +3128,7 @@
 </file>
 
 <file path=word/endnotes.xml><?xml version="1.0" encoding="utf-8"?>
-<w:endnotes xmlns:wpc="http://schemas.microsoft.com/office/word/2010/wordprocessingCanvas" xmlns:cx="http://schemas.microsoft.com/office/drawing/2014/chartex" xmlns:cx1="http://schemas.microsoft.com/office/drawing/2015/9/8/chartex" xmlns:cx2="http://schemas.microsoft.com/office/drawing/2015/10/21/chartex" xmlns:cx3="http://schemas.microsoft.com/office/drawing/2016/5/9/chartex" xmlns:cx4="http://schemas.microsoft.com/office/drawing/2016/5/10/chartex" xmlns:cx5="http://schemas.microsoft.com/office/drawing/2016/5/11/chartex" xmlns:cx6="http://schemas.microsoft.com/office/drawing/2016/5/12/chartex" xmlns:cx7="http://schemas.microsoft.com/office/drawing/2016/5/13/chartex" xmlns:cx8="http://schemas.microsoft.com/office/drawing/2016/5/14/chartex" xmlns:mc="http://schemas.openxmlformats.org/markup-compatibility/2006" xmlns:aink="http://schemas.microsoft.com/office/drawing/2016/ink" xmlns:am3d="http://schemas.microsoft.com/office/drawing/2017/model3d" xmlns:o="urn:schemas-microsoft-com:office:office" xmlns:oel="http://schemas.microsoft.com/office/2019/extlst" xmlns:r="http://schemas.openxmlformats.org/officeDocument/2006/relationships" xmlns:m="http://schemas.openxmlformats.org/officeDocument/2006/math" xmlns:v="urn:schemas-microsoft-com:vml" xmlns:wp14="http://schemas.microsoft.com/office/word/2010/wordprocessingDrawing" xmlns:wp="http://schemas.openxmlformats.org/drawingml/2006/wordprocessingDrawing" xmlns:w10="urn:schemas-microsoft-com:office:word" xmlns:w="http://schemas.openxmlformats.org/wordprocessingml/2006/main" xmlns:w14="http://schemas.microsoft.com/office/word/2010/wordml" xmlns:w15="http://schemas.microsoft.com/office/word/2012/wordml" xmlns:w16cex="http://schemas.microsoft.com/office/word/2018/wordml/cex" xmlns:w16cid="http://schemas.microsoft.com/office/word/2016/wordml/cid" xmlns:w16="http://schemas.microsoft.com/office/word/2018/wordml" xmlns:w16du="http://schemas.microsoft.com/office/word/2023/wordml/word16du" xmlns:w16sdtdh="http://schemas.microsoft.com/office/word/2020/wordml/sdtdatahash" xmlns:w16se="http://schemas.microsoft.com/office/word/2015/wordml/symex" xmlns:wpg="http://schemas.microsoft.com/office/word/2010/wordprocessingGroup" xmlns:wpi="http://schemas.microsoft.com/office/word/2010/wordprocessingInk" xmlns:wne="http://schemas.microsoft.com/office/word/2006/wordml" xmlns:wps="http://schemas.microsoft.com/office/word/2010/wordprocessingShape" mc:Ignorable="w14 w15 w16se w16cid w16 w16cex w16sdtdh w16du wp14">
+<w:endnotes xmlns:wpc="http://schemas.microsoft.com/office/word/2010/wordprocessingCanvas" xmlns:cx="http://schemas.microsoft.com/office/drawing/2014/chartex" xmlns:cx1="http://schemas.microsoft.com/office/drawing/2015/9/8/chartex" xmlns:cx2="http://schemas.microsoft.com/office/drawing/2015/10/21/chartex" xmlns:cx3="http://schemas.microsoft.com/office/drawing/2016/5/9/chartex" xmlns:cx4="http://schemas.microsoft.com/office/drawing/2016/5/10/chartex" xmlns:cx5="http://schemas.microsoft.com/office/drawing/2016/5/11/chartex" xmlns:cx6="http://schemas.microsoft.com/office/drawing/2016/5/12/chartex" xmlns:cx7="http://schemas.microsoft.com/office/drawing/2016/5/13/chartex" xmlns:cx8="http://schemas.microsoft.com/office/drawing/2016/5/14/chartex" xmlns:mc="http://schemas.openxmlformats.org/markup-compatibility/2006" xmlns:aink="http://schemas.microsoft.com/office/drawing/2016/ink" xmlns:am3d="http://schemas.microsoft.com/office/drawing/2017/model3d" xmlns:o="urn:schemas-microsoft-com:office:office" xmlns:oel="http://schemas.microsoft.com/office/2019/extlst" xmlns:r="http://schemas.openxmlformats.org/officeDocument/2006/relationships" xmlns:m="http://schemas.openxmlformats.org/officeDocument/2006/math" xmlns:v="urn:schemas-microsoft-com:vml" xmlns:wp14="http://schemas.microsoft.com/office/word/2010/wordprocessingDrawing" xmlns:wp="http://schemas.openxmlformats.org/drawingml/2006/wordprocessingDrawing" xmlns:w10="urn:schemas-microsoft-com:office:word" xmlns:w="http://schemas.openxmlformats.org/wordprocessingml/2006/main" xmlns:w14="http://schemas.microsoft.com/office/word/2010/wordml" xmlns:w15="http://schemas.microsoft.com/office/word/2012/wordml" xmlns:w16cex="http://schemas.microsoft.com/office/word/2018/wordml/cex" xmlns:w16cid="http://schemas.microsoft.com/office/word/2016/wordml/cid" xmlns:w16="http://schemas.microsoft.com/office/word/2018/wordml" xmlns:w16du="http://schemas.microsoft.com/office/word/2023/wordml/word16du" xmlns:w16sdtdh="http://schemas.microsoft.com/office/word/2020/wordml/sdtdatahash" xmlns:w16sdtfl="http://schemas.microsoft.com/office/word/2024/wordml/sdtformatlock" xmlns:w16se="http://schemas.microsoft.com/office/word/2015/wordml/symex" xmlns:wpg="http://schemas.microsoft.com/office/word/2010/wordprocessingGroup" xmlns:wpi="http://schemas.microsoft.com/office/word/2010/wordprocessingInk" xmlns:wne="http://schemas.microsoft.com/office/word/2006/wordml" xmlns:wps="http://schemas.microsoft.com/office/word/2010/wordprocessingShape" mc:Ignorable="w14 w15 w16se w16cid w16 w16cex w16sdtdh w16sdtfl w16du wp14">
   <w:endnote w:type="separator" w:id="-1">
     <w:p>
       <w:r>
@@ -3029,7 +3147,7 @@
 </file>
 
 <file path=word/footer1.xml><?xml version="1.0" encoding="utf-8"?>
-<w:ftr xmlns:wpc="http://schemas.microsoft.com/office/word/2010/wordprocessingCanvas" xmlns:cx="http://schemas.microsoft.com/office/drawing/2014/chartex" xmlns:cx1="http://schemas.microsoft.com/office/drawing/2015/9/8/chartex" xmlns:cx2="http://schemas.microsoft.com/office/drawing/2015/10/21/chartex" xmlns:cx3="http://schemas.microsoft.com/office/drawing/2016/5/9/chartex" xmlns:cx4="http://schemas.microsoft.com/office/drawing/2016/5/10/chartex" xmlns:cx5="http://schemas.microsoft.com/office/drawing/2016/5/11/chartex" xmlns:cx6="http://schemas.microsoft.com/office/drawing/2016/5/12/chartex" xmlns:cx7="http://schemas.microsoft.com/office/drawing/2016/5/13/chartex" xmlns:cx8="http://schemas.microsoft.com/office/drawing/2016/5/14/chartex" xmlns:mc="http://schemas.openxmlformats.org/markup-compatibility/2006" xmlns:aink="http://schemas.microsoft.com/office/drawing/2016/ink" xmlns:am3d="http://schemas.microsoft.com/office/drawing/2017/model3d" xmlns:o="urn:schemas-microsoft-com:office:office" xmlns:oel="http://schemas.microsoft.com/office/2019/extlst" xmlns:r="http://schemas.openxmlformats.org/officeDocument/2006/relationships" xmlns:m="http://schemas.openxmlformats.org/officeDocument/2006/math" xmlns:v="urn:schemas-microsoft-com:vml" xmlns:wp14="http://schemas.microsoft.com/office/word/2010/wordprocessingDrawing" xmlns:wp="http://schemas.openxmlformats.org/drawingml/2006/wordprocessingDrawing" xmlns:w10="urn:schemas-microsoft-com:office:word" xmlns:w="http://schemas.openxmlformats.org/wordprocessingml/2006/main" xmlns:w14="http://schemas.microsoft.com/office/word/2010/wordml" xmlns:w15="http://schemas.microsoft.com/office/word/2012/wordml" xmlns:w16cex="http://schemas.microsoft.com/office/word/2018/wordml/cex" xmlns:w16cid="http://schemas.microsoft.com/office/word/2016/wordml/cid" xmlns:w16="http://schemas.microsoft.com/office/word/2018/wordml" xmlns:w16du="http://schemas.microsoft.com/office/word/2023/wordml/word16du" xmlns:w16sdtdh="http://schemas.microsoft.com/office/word/2020/wordml/sdtdatahash" xmlns:w16se="http://schemas.microsoft.com/office/word/2015/wordml/symex" xmlns:wpg="http://schemas.microsoft.com/office/word/2010/wordprocessingGroup" xmlns:wpi="http://schemas.microsoft.com/office/word/2010/wordprocessingInk" xmlns:wne="http://schemas.microsoft.com/office/word/2006/wordml" xmlns:wps="http://schemas.microsoft.com/office/word/2010/wordprocessingShape" mc:Ignorable="w14 w15 w16se w16cid w16 w16cex w16sdtdh w16du wp14">
+<w:ftr xmlns:wpc="http://schemas.microsoft.com/office/word/2010/wordprocessingCanvas" xmlns:cx="http://schemas.microsoft.com/office/drawing/2014/chartex" xmlns:cx1="http://schemas.microsoft.com/office/drawing/2015/9/8/chartex" xmlns:cx2="http://schemas.microsoft.com/office/drawing/2015/10/21/chartex" xmlns:cx3="http://schemas.microsoft.com/office/drawing/2016/5/9/chartex" xmlns:cx4="http://schemas.microsoft.com/office/drawing/2016/5/10/chartex" xmlns:cx5="http://schemas.microsoft.com/office/drawing/2016/5/11/chartex" xmlns:cx6="http://schemas.microsoft.com/office/drawing/2016/5/12/chartex" xmlns:cx7="http://schemas.microsoft.com/office/drawing/2016/5/13/chartex" xmlns:cx8="http://schemas.microsoft.com/office/drawing/2016/5/14/chartex" xmlns:mc="http://schemas.openxmlformats.org/markup-compatibility/2006" xmlns:aink="http://schemas.microsoft.com/office/drawing/2016/ink" xmlns:am3d="http://schemas.microsoft.com/office/drawing/2017/model3d" xmlns:o="urn:schemas-microsoft-com:office:office" xmlns:oel="http://schemas.microsoft.com/office/2019/extlst" xmlns:r="http://schemas.openxmlformats.org/officeDocument/2006/relationships" xmlns:m="http://schemas.openxmlformats.org/officeDocument/2006/math" xmlns:v="urn:schemas-microsoft-com:vml" xmlns:wp14="http://schemas.microsoft.com/office/word/2010/wordprocessingDrawing" xmlns:wp="http://schemas.openxmlformats.org/drawingml/2006/wordprocessingDrawing" xmlns:w10="urn:schemas-microsoft-com:office:word" xmlns:w="http://schemas.openxmlformats.org/wordprocessingml/2006/main" xmlns:w14="http://schemas.microsoft.com/office/word/2010/wordml" xmlns:w15="http://schemas.microsoft.com/office/word/2012/wordml" xmlns:w16cex="http://schemas.microsoft.com/office/word/2018/wordml/cex" xmlns:w16cid="http://schemas.microsoft.com/office/word/2016/wordml/cid" xmlns:w16="http://schemas.microsoft.com/office/word/2018/wordml" xmlns:w16du="http://schemas.microsoft.com/office/word/2023/wordml/word16du" xmlns:w16sdtdh="http://schemas.microsoft.com/office/word/2020/wordml/sdtdatahash" xmlns:w16sdtfl="http://schemas.microsoft.com/office/word/2024/wordml/sdtformatlock" xmlns:w16se="http://schemas.microsoft.com/office/word/2015/wordml/symex" xmlns:wpg="http://schemas.microsoft.com/office/word/2010/wordprocessingGroup" xmlns:wpi="http://schemas.microsoft.com/office/word/2010/wordprocessingInk" xmlns:wne="http://schemas.microsoft.com/office/word/2006/wordml" xmlns:wps="http://schemas.microsoft.com/office/word/2010/wordprocessingShape" mc:Ignorable="w14 w15 w16se w16cid w16 w16cex w16sdtdh w16sdtfl w16du wp14">
   <w:p>
     <w:pPr>
       <w:pStyle w:val="EstiloPie"/>
@@ -3053,13 +3171,13 @@
 </file>
 
 <file path=word/footer2.xml><?xml version="1.0" encoding="utf-8"?>
-<w:ftr xmlns:wpc="http://schemas.microsoft.com/office/word/2010/wordprocessingCanvas" xmlns:cx="http://schemas.microsoft.com/office/drawing/2014/chartex" xmlns:cx1="http://schemas.microsoft.com/office/drawing/2015/9/8/chartex" xmlns:cx2="http://schemas.microsoft.com/office/drawing/2015/10/21/chartex" xmlns:cx3="http://schemas.microsoft.com/office/drawing/2016/5/9/chartex" xmlns:cx4="http://schemas.microsoft.com/office/drawing/2016/5/10/chartex" xmlns:cx5="http://schemas.microsoft.com/office/drawing/2016/5/11/chartex" xmlns:cx6="http://schemas.microsoft.com/office/drawing/2016/5/12/chartex" xmlns:cx7="http://schemas.microsoft.com/office/drawing/2016/5/13/chartex" xmlns:cx8="http://schemas.microsoft.com/office/drawing/2016/5/14/chartex" xmlns:mc="http://schemas.openxmlformats.org/markup-compatibility/2006" xmlns:aink="http://schemas.microsoft.com/office/drawing/2016/ink" xmlns:am3d="http://schemas.microsoft.com/office/drawing/2017/model3d" xmlns:o="urn:schemas-microsoft-com:office:office" xmlns:oel="http://schemas.microsoft.com/office/2019/extlst" xmlns:r="http://schemas.openxmlformats.org/officeDocument/2006/relationships" xmlns:m="http://schemas.openxmlformats.org/officeDocument/2006/math" xmlns:v="urn:schemas-microsoft-com:vml" xmlns:wp14="http://schemas.microsoft.com/office/word/2010/wordprocessingDrawing" xmlns:wp="http://schemas.openxmlformats.org/drawingml/2006/wordprocessingDrawing" xmlns:w10="urn:schemas-microsoft-com:office:word" xmlns:w="http://schemas.openxmlformats.org/wordprocessingml/2006/main" xmlns:w14="http://schemas.microsoft.com/office/word/2010/wordml" xmlns:w15="http://schemas.microsoft.com/office/word/2012/wordml" xmlns:w16cex="http://schemas.microsoft.com/office/word/2018/wordml/cex" xmlns:w16cid="http://schemas.microsoft.com/office/word/2016/wordml/cid" xmlns:w16="http://schemas.microsoft.com/office/word/2018/wordml" xmlns:w16du="http://schemas.microsoft.com/office/word/2023/wordml/word16du" xmlns:w16sdtdh="http://schemas.microsoft.com/office/word/2020/wordml/sdtdatahash" xmlns:w16se="http://schemas.microsoft.com/office/word/2015/wordml/symex" xmlns:wpg="http://schemas.microsoft.com/office/word/2010/wordprocessingGroup" xmlns:wpi="http://schemas.microsoft.com/office/word/2010/wordprocessingInk" xmlns:wne="http://schemas.microsoft.com/office/word/2006/wordml" xmlns:wps="http://schemas.microsoft.com/office/word/2010/wordprocessingShape" mc:Ignorable="w14 w15 w16se w16cid w16 w16cex w16sdtdh w16du wp14">
+<w:ftr xmlns:wpc="http://schemas.microsoft.com/office/word/2010/wordprocessingCanvas" xmlns:cx="http://schemas.microsoft.com/office/drawing/2014/chartex" xmlns:cx1="http://schemas.microsoft.com/office/drawing/2015/9/8/chartex" xmlns:cx2="http://schemas.microsoft.com/office/drawing/2015/10/21/chartex" xmlns:cx3="http://schemas.microsoft.com/office/drawing/2016/5/9/chartex" xmlns:cx4="http://schemas.microsoft.com/office/drawing/2016/5/10/chartex" xmlns:cx5="http://schemas.microsoft.com/office/drawing/2016/5/11/chartex" xmlns:cx6="http://schemas.microsoft.com/office/drawing/2016/5/12/chartex" xmlns:cx7="http://schemas.microsoft.com/office/drawing/2016/5/13/chartex" xmlns:cx8="http://schemas.microsoft.com/office/drawing/2016/5/14/chartex" xmlns:mc="http://schemas.openxmlformats.org/markup-compatibility/2006" xmlns:aink="http://schemas.microsoft.com/office/drawing/2016/ink" xmlns:am3d="http://schemas.microsoft.com/office/drawing/2017/model3d" xmlns:o="urn:schemas-microsoft-com:office:office" xmlns:oel="http://schemas.microsoft.com/office/2019/extlst" xmlns:r="http://schemas.openxmlformats.org/officeDocument/2006/relationships" xmlns:m="http://schemas.openxmlformats.org/officeDocument/2006/math" xmlns:v="urn:schemas-microsoft-com:vml" xmlns:wp14="http://schemas.microsoft.com/office/word/2010/wordprocessingDrawing" xmlns:wp="http://schemas.openxmlformats.org/drawingml/2006/wordprocessingDrawing" xmlns:w10="urn:schemas-microsoft-com:office:word" xmlns:w="http://schemas.openxmlformats.org/wordprocessingml/2006/main" xmlns:w14="http://schemas.microsoft.com/office/word/2010/wordml" xmlns:w15="http://schemas.microsoft.com/office/word/2012/wordml" xmlns:w16cex="http://schemas.microsoft.com/office/word/2018/wordml/cex" xmlns:w16cid="http://schemas.microsoft.com/office/word/2016/wordml/cid" xmlns:w16="http://schemas.microsoft.com/office/word/2018/wordml" xmlns:w16du="http://schemas.microsoft.com/office/word/2023/wordml/word16du" xmlns:w16sdtdh="http://schemas.microsoft.com/office/word/2020/wordml/sdtdatahash" xmlns:w16sdtfl="http://schemas.microsoft.com/office/word/2024/wordml/sdtformatlock" xmlns:w16se="http://schemas.microsoft.com/office/word/2015/wordml/symex" xmlns:wpg="http://schemas.microsoft.com/office/word/2010/wordprocessingGroup" xmlns:wpi="http://schemas.microsoft.com/office/word/2010/wordprocessingInk" xmlns:wne="http://schemas.microsoft.com/office/word/2006/wordml" xmlns:wps="http://schemas.microsoft.com/office/word/2010/wordprocessingShape" mc:Ignorable="w14 w15 w16se w16cid w16 w16cex w16sdtdh w16sdtfl w16du wp14">
   <w:p/>
 </w:ftr>
 </file>
 
 <file path=word/footer3.xml><?xml version="1.0" encoding="utf-8"?>
-<w:ftr xmlns:wpc="http://schemas.microsoft.com/office/word/2010/wordprocessingCanvas" xmlns:cx="http://schemas.microsoft.com/office/drawing/2014/chartex" xmlns:cx1="http://schemas.microsoft.com/office/drawing/2015/9/8/chartex" xmlns:cx2="http://schemas.microsoft.com/office/drawing/2015/10/21/chartex" xmlns:cx3="http://schemas.microsoft.com/office/drawing/2016/5/9/chartex" xmlns:cx4="http://schemas.microsoft.com/office/drawing/2016/5/10/chartex" xmlns:cx5="http://schemas.microsoft.com/office/drawing/2016/5/11/chartex" xmlns:cx6="http://schemas.microsoft.com/office/drawing/2016/5/12/chartex" xmlns:cx7="http://schemas.microsoft.com/office/drawing/2016/5/13/chartex" xmlns:cx8="http://schemas.microsoft.com/office/drawing/2016/5/14/chartex" xmlns:mc="http://schemas.openxmlformats.org/markup-compatibility/2006" xmlns:aink="http://schemas.microsoft.com/office/drawing/2016/ink" xmlns:am3d="http://schemas.microsoft.com/office/drawing/2017/model3d" xmlns:o="urn:schemas-microsoft-com:office:office" xmlns:oel="http://schemas.microsoft.com/office/2019/extlst" xmlns:r="http://schemas.openxmlformats.org/officeDocument/2006/relationships" xmlns:m="http://schemas.openxmlformats.org/officeDocument/2006/math" xmlns:v="urn:schemas-microsoft-com:vml" xmlns:wp14="http://schemas.microsoft.com/office/word/2010/wordprocessingDrawing" xmlns:wp="http://schemas.openxmlformats.org/drawingml/2006/wordprocessingDrawing" xmlns:w10="urn:schemas-microsoft-com:office:word" xmlns:w="http://schemas.openxmlformats.org/wordprocessingml/2006/main" xmlns:w14="http://schemas.microsoft.com/office/word/2010/wordml" xmlns:w15="http://schemas.microsoft.com/office/word/2012/wordml" xmlns:w16cex="http://schemas.microsoft.com/office/word/2018/wordml/cex" xmlns:w16cid="http://schemas.microsoft.com/office/word/2016/wordml/cid" xmlns:w16="http://schemas.microsoft.com/office/word/2018/wordml" xmlns:w16du="http://schemas.microsoft.com/office/word/2023/wordml/word16du" xmlns:w16sdtdh="http://schemas.microsoft.com/office/word/2020/wordml/sdtdatahash" xmlns:w16se="http://schemas.microsoft.com/office/word/2015/wordml/symex" xmlns:wpg="http://schemas.microsoft.com/office/word/2010/wordprocessingGroup" xmlns:wpi="http://schemas.microsoft.com/office/word/2010/wordprocessingInk" xmlns:wne="http://schemas.microsoft.com/office/word/2006/wordml" xmlns:wps="http://schemas.microsoft.com/office/word/2010/wordprocessingShape" mc:Ignorable="w14 w15 w16se w16cid w16 w16cex w16sdtdh w16du wp14">
+<w:ftr xmlns:wpc="http://schemas.microsoft.com/office/word/2010/wordprocessingCanvas" xmlns:cx="http://schemas.microsoft.com/office/drawing/2014/chartex" xmlns:cx1="http://schemas.microsoft.com/office/drawing/2015/9/8/chartex" xmlns:cx2="http://schemas.microsoft.com/office/drawing/2015/10/21/chartex" xmlns:cx3="http://schemas.microsoft.com/office/drawing/2016/5/9/chartex" xmlns:cx4="http://schemas.microsoft.com/office/drawing/2016/5/10/chartex" xmlns:cx5="http://schemas.microsoft.com/office/drawing/2016/5/11/chartex" xmlns:cx6="http://schemas.microsoft.com/office/drawing/2016/5/12/chartex" xmlns:cx7="http://schemas.microsoft.com/office/drawing/2016/5/13/chartex" xmlns:cx8="http://schemas.microsoft.com/office/drawing/2016/5/14/chartex" xmlns:mc="http://schemas.openxmlformats.org/markup-compatibility/2006" xmlns:aink="http://schemas.microsoft.com/office/drawing/2016/ink" xmlns:am3d="http://schemas.microsoft.com/office/drawing/2017/model3d" xmlns:o="urn:schemas-microsoft-com:office:office" xmlns:oel="http://schemas.microsoft.com/office/2019/extlst" xmlns:r="http://schemas.openxmlformats.org/officeDocument/2006/relationships" xmlns:m="http://schemas.openxmlformats.org/officeDocument/2006/math" xmlns:v="urn:schemas-microsoft-com:vml" xmlns:wp14="http://schemas.microsoft.com/office/word/2010/wordprocessingDrawing" xmlns:wp="http://schemas.openxmlformats.org/drawingml/2006/wordprocessingDrawing" xmlns:w10="urn:schemas-microsoft-com:office:word" xmlns:w="http://schemas.openxmlformats.org/wordprocessingml/2006/main" xmlns:w14="http://schemas.microsoft.com/office/word/2010/wordml" xmlns:w15="http://schemas.microsoft.com/office/word/2012/wordml" xmlns:w16cex="http://schemas.microsoft.com/office/word/2018/wordml/cex" xmlns:w16cid="http://schemas.microsoft.com/office/word/2016/wordml/cid" xmlns:w16="http://schemas.microsoft.com/office/word/2018/wordml" xmlns:w16du="http://schemas.microsoft.com/office/word/2023/wordml/word16du" xmlns:w16sdtdh="http://schemas.microsoft.com/office/word/2020/wordml/sdtdatahash" xmlns:w16sdtfl="http://schemas.microsoft.com/office/word/2024/wordml/sdtformatlock" xmlns:w16se="http://schemas.microsoft.com/office/word/2015/wordml/symex" xmlns:wpg="http://schemas.microsoft.com/office/word/2010/wordprocessingGroup" xmlns:wpi="http://schemas.microsoft.com/office/word/2010/wordprocessingInk" xmlns:wne="http://schemas.microsoft.com/office/word/2006/wordml" xmlns:wps="http://schemas.microsoft.com/office/word/2010/wordprocessingShape" mc:Ignorable="w14 w15 w16se w16cid w16 w16cex w16sdtdh w16sdtfl w16du wp14">
   <w:p/>
   <w:p>
     <w:r>
@@ -3088,13 +3206,13 @@
 </file>
 
 <file path=word/footer4.xml><?xml version="1.0" encoding="utf-8"?>
-<w:ftr xmlns:wpc="http://schemas.microsoft.com/office/word/2010/wordprocessingCanvas" xmlns:cx="http://schemas.microsoft.com/office/drawing/2014/chartex" xmlns:cx1="http://schemas.microsoft.com/office/drawing/2015/9/8/chartex" xmlns:cx2="http://schemas.microsoft.com/office/drawing/2015/10/21/chartex" xmlns:cx3="http://schemas.microsoft.com/office/drawing/2016/5/9/chartex" xmlns:cx4="http://schemas.microsoft.com/office/drawing/2016/5/10/chartex" xmlns:cx5="http://schemas.microsoft.com/office/drawing/2016/5/11/chartex" xmlns:cx6="http://schemas.microsoft.com/office/drawing/2016/5/12/chartex" xmlns:cx7="http://schemas.microsoft.com/office/drawing/2016/5/13/chartex" xmlns:cx8="http://schemas.microsoft.com/office/drawing/2016/5/14/chartex" xmlns:mc="http://schemas.openxmlformats.org/markup-compatibility/2006" xmlns:aink="http://schemas.microsoft.com/office/drawing/2016/ink" xmlns:am3d="http://schemas.microsoft.com/office/drawing/2017/model3d" xmlns:o="urn:schemas-microsoft-com:office:office" xmlns:oel="http://schemas.microsoft.com/office/2019/extlst" xmlns:r="http://schemas.openxmlformats.org/officeDocument/2006/relationships" xmlns:m="http://schemas.openxmlformats.org/officeDocument/2006/math" xmlns:v="urn:schemas-microsoft-com:vml" xmlns:wp14="http://schemas.microsoft.com/office/word/2010/wordprocessingDrawing" xmlns:wp="http://schemas.openxmlformats.org/drawingml/2006/wordprocessingDrawing" xmlns:w10="urn:schemas-microsoft-com:office:word" xmlns:w="http://schemas.openxmlformats.org/wordprocessingml/2006/main" xmlns:w14="http://schemas.microsoft.com/office/word/2010/wordml" xmlns:w15="http://schemas.microsoft.com/office/word/2012/wordml" xmlns:w16cex="http://schemas.microsoft.com/office/word/2018/wordml/cex" xmlns:w16cid="http://schemas.microsoft.com/office/word/2016/wordml/cid" xmlns:w16="http://schemas.microsoft.com/office/word/2018/wordml" xmlns:w16du="http://schemas.microsoft.com/office/word/2023/wordml/word16du" xmlns:w16sdtdh="http://schemas.microsoft.com/office/word/2020/wordml/sdtdatahash" xmlns:w16se="http://schemas.microsoft.com/office/word/2015/wordml/symex" xmlns:wpg="http://schemas.microsoft.com/office/word/2010/wordprocessingGroup" xmlns:wpi="http://schemas.microsoft.com/office/word/2010/wordprocessingInk" xmlns:wne="http://schemas.microsoft.com/office/word/2006/wordml" xmlns:wps="http://schemas.microsoft.com/office/word/2010/wordprocessingShape" mc:Ignorable="w14 w15 w16se w16cid w16 w16cex w16sdtdh w16du wp14">
+<w:ftr xmlns:wpc="http://schemas.microsoft.com/office/word/2010/wordprocessingCanvas" xmlns:cx="http://schemas.microsoft.com/office/drawing/2014/chartex" xmlns:cx1="http://schemas.microsoft.com/office/drawing/2015/9/8/chartex" xmlns:cx2="http://schemas.microsoft.com/office/drawing/2015/10/21/chartex" xmlns:cx3="http://schemas.microsoft.com/office/drawing/2016/5/9/chartex" xmlns:cx4="http://schemas.microsoft.com/office/drawing/2016/5/10/chartex" xmlns:cx5="http://schemas.microsoft.com/office/drawing/2016/5/11/chartex" xmlns:cx6="http://schemas.microsoft.com/office/drawing/2016/5/12/chartex" xmlns:cx7="http://schemas.microsoft.com/office/drawing/2016/5/13/chartex" xmlns:cx8="http://schemas.microsoft.com/office/drawing/2016/5/14/chartex" xmlns:mc="http://schemas.openxmlformats.org/markup-compatibility/2006" xmlns:aink="http://schemas.microsoft.com/office/drawing/2016/ink" xmlns:am3d="http://schemas.microsoft.com/office/drawing/2017/model3d" xmlns:o="urn:schemas-microsoft-com:office:office" xmlns:oel="http://schemas.microsoft.com/office/2019/extlst" xmlns:r="http://schemas.openxmlformats.org/officeDocument/2006/relationships" xmlns:m="http://schemas.openxmlformats.org/officeDocument/2006/math" xmlns:v="urn:schemas-microsoft-com:vml" xmlns:wp14="http://schemas.microsoft.com/office/word/2010/wordprocessingDrawing" xmlns:wp="http://schemas.openxmlformats.org/drawingml/2006/wordprocessingDrawing" xmlns:w10="urn:schemas-microsoft-com:office:word" xmlns:w="http://schemas.openxmlformats.org/wordprocessingml/2006/main" xmlns:w14="http://schemas.microsoft.com/office/word/2010/wordml" xmlns:w15="http://schemas.microsoft.com/office/word/2012/wordml" xmlns:w16cex="http://schemas.microsoft.com/office/word/2018/wordml/cex" xmlns:w16cid="http://schemas.microsoft.com/office/word/2016/wordml/cid" xmlns:w16="http://schemas.microsoft.com/office/word/2018/wordml" xmlns:w16du="http://schemas.microsoft.com/office/word/2023/wordml/word16du" xmlns:w16sdtdh="http://schemas.microsoft.com/office/word/2020/wordml/sdtdatahash" xmlns:w16sdtfl="http://schemas.microsoft.com/office/word/2024/wordml/sdtformatlock" xmlns:w16se="http://schemas.microsoft.com/office/word/2015/wordml/symex" xmlns:wpg="http://schemas.microsoft.com/office/word/2010/wordprocessingGroup" xmlns:wpi="http://schemas.microsoft.com/office/word/2010/wordprocessingInk" xmlns:wne="http://schemas.microsoft.com/office/word/2006/wordml" xmlns:wps="http://schemas.microsoft.com/office/word/2010/wordprocessingShape" mc:Ignorable="w14 w15 w16se w16cid w16 w16cex w16sdtdh w16sdtfl w16du wp14">
   <w:p/>
 </w:ftr>
 </file>
 
 <file path=word/footnotes.xml><?xml version="1.0" encoding="utf-8"?>
-<w:footnotes xmlns:wpc="http://schemas.microsoft.com/office/word/2010/wordprocessingCanvas" xmlns:cx="http://schemas.microsoft.com/office/drawing/2014/chartex" xmlns:cx1="http://schemas.microsoft.com/office/drawing/2015/9/8/chartex" xmlns:cx2="http://schemas.microsoft.com/office/drawing/2015/10/21/chartex" xmlns:cx3="http://schemas.microsoft.com/office/drawing/2016/5/9/chartex" xmlns:cx4="http://schemas.microsoft.com/office/drawing/2016/5/10/chartex" xmlns:cx5="http://schemas.microsoft.com/office/drawing/2016/5/11/chartex" xmlns:cx6="http://schemas.microsoft.com/office/drawing/2016/5/12/chartex" xmlns:cx7="http://schemas.microsoft.com/office/drawing/2016/5/13/chartex" xmlns:cx8="http://schemas.microsoft.com/office/drawing/2016/5/14/chartex" xmlns:mc="http://schemas.openxmlformats.org/markup-compatibility/2006" xmlns:aink="http://schemas.microsoft.com/office/drawing/2016/ink" xmlns:am3d="http://schemas.microsoft.com/office/drawing/2017/model3d" xmlns:o="urn:schemas-microsoft-com:office:office" xmlns:oel="http://schemas.microsoft.com/office/2019/extlst" xmlns:r="http://schemas.openxmlformats.org/officeDocument/2006/relationships" xmlns:m="http://schemas.openxmlformats.org/officeDocument/2006/math" xmlns:v="urn:schemas-microsoft-com:vml" xmlns:wp14="http://schemas.microsoft.com/office/word/2010/wordprocessingDrawing" xmlns:wp="http://schemas.openxmlformats.org/drawingml/2006/wordprocessingDrawing" xmlns:w10="urn:schemas-microsoft-com:office:word" xmlns:w="http://schemas.openxmlformats.org/wordprocessingml/2006/main" xmlns:w14="http://schemas.microsoft.com/office/word/2010/wordml" xmlns:w15="http://schemas.microsoft.com/office/word/2012/wordml" xmlns:w16cex="http://schemas.microsoft.com/office/word/2018/wordml/cex" xmlns:w16cid="http://schemas.microsoft.com/office/word/2016/wordml/cid" xmlns:w16="http://schemas.microsoft.com/office/word/2018/wordml" xmlns:w16du="http://schemas.microsoft.com/office/word/2023/wordml/word16du" xmlns:w16sdtdh="http://schemas.microsoft.com/office/word/2020/wordml/sdtdatahash" xmlns:w16se="http://schemas.microsoft.com/office/word/2015/wordml/symex" xmlns:wpg="http://schemas.microsoft.com/office/word/2010/wordprocessingGroup" xmlns:wpi="http://schemas.microsoft.com/office/word/2010/wordprocessingInk" xmlns:wne="http://schemas.microsoft.com/office/word/2006/wordml" xmlns:wps="http://schemas.microsoft.com/office/word/2010/wordprocessingShape" mc:Ignorable="w14 w15 w16se w16cid w16 w16cex w16sdtdh w16du wp14">
+<w:footnotes xmlns:wpc="http://schemas.microsoft.com/office/word/2010/wordprocessingCanvas" xmlns:cx="http://schemas.microsoft.com/office/drawing/2014/chartex" xmlns:cx1="http://schemas.microsoft.com/office/drawing/2015/9/8/chartex" xmlns:cx2="http://schemas.microsoft.com/office/drawing/2015/10/21/chartex" xmlns:cx3="http://schemas.microsoft.com/office/drawing/2016/5/9/chartex" xmlns:cx4="http://schemas.microsoft.com/office/drawing/2016/5/10/chartex" xmlns:cx5="http://schemas.microsoft.com/office/drawing/2016/5/11/chartex" xmlns:cx6="http://schemas.microsoft.com/office/drawing/2016/5/12/chartex" xmlns:cx7="http://schemas.microsoft.com/office/drawing/2016/5/13/chartex" xmlns:cx8="http://schemas.microsoft.com/office/drawing/2016/5/14/chartex" xmlns:mc="http://schemas.openxmlformats.org/markup-compatibility/2006" xmlns:aink="http://schemas.microsoft.com/office/drawing/2016/ink" xmlns:am3d="http://schemas.microsoft.com/office/drawing/2017/model3d" xmlns:o="urn:schemas-microsoft-com:office:office" xmlns:oel="http://schemas.microsoft.com/office/2019/extlst" xmlns:r="http://schemas.openxmlformats.org/officeDocument/2006/relationships" xmlns:m="http://schemas.openxmlformats.org/officeDocument/2006/math" xmlns:v="urn:schemas-microsoft-com:vml" xmlns:wp14="http://schemas.microsoft.com/office/word/2010/wordprocessingDrawing" xmlns:wp="http://schemas.openxmlformats.org/drawingml/2006/wordprocessingDrawing" xmlns:w10="urn:schemas-microsoft-com:office:word" xmlns:w="http://schemas.openxmlformats.org/wordprocessingml/2006/main" xmlns:w14="http://schemas.microsoft.com/office/word/2010/wordml" xmlns:w15="http://schemas.microsoft.com/office/word/2012/wordml" xmlns:w16cex="http://schemas.microsoft.com/office/word/2018/wordml/cex" xmlns:w16cid="http://schemas.microsoft.com/office/word/2016/wordml/cid" xmlns:w16="http://schemas.microsoft.com/office/word/2018/wordml" xmlns:w16du="http://schemas.microsoft.com/office/word/2023/wordml/word16du" xmlns:w16sdtdh="http://schemas.microsoft.com/office/word/2020/wordml/sdtdatahash" xmlns:w16sdtfl="http://schemas.microsoft.com/office/word/2024/wordml/sdtformatlock" xmlns:w16se="http://schemas.microsoft.com/office/word/2015/wordml/symex" xmlns:wpg="http://schemas.microsoft.com/office/word/2010/wordprocessingGroup" xmlns:wpi="http://schemas.microsoft.com/office/word/2010/wordprocessingInk" xmlns:wne="http://schemas.microsoft.com/office/word/2006/wordml" xmlns:wps="http://schemas.microsoft.com/office/word/2010/wordprocessingShape" mc:Ignorable="w14 w15 w16se w16cid w16 w16cex w16sdtdh w16sdtfl w16du wp14">
   <w:footnote w:type="separator" w:id="-1">
     <w:p>
       <w:r>
@@ -3113,13 +3231,13 @@
 </file>
 
 <file path=word/header1.xml><?xml version="1.0" encoding="utf-8"?>
-<w:hdr xmlns:wpc="http://schemas.microsoft.com/office/word/2010/wordprocessingCanvas" xmlns:cx="http://schemas.microsoft.com/office/drawing/2014/chartex" xmlns:cx1="http://schemas.microsoft.com/office/drawing/2015/9/8/chartex" xmlns:cx2="http://schemas.microsoft.com/office/drawing/2015/10/21/chartex" xmlns:cx3="http://schemas.microsoft.com/office/drawing/2016/5/9/chartex" xmlns:cx4="http://schemas.microsoft.com/office/drawing/2016/5/10/chartex" xmlns:cx5="http://schemas.microsoft.com/office/drawing/2016/5/11/chartex" xmlns:cx6="http://schemas.microsoft.com/office/drawing/2016/5/12/chartex" xmlns:cx7="http://schemas.microsoft.com/office/drawing/2016/5/13/chartex" xmlns:cx8="http://schemas.microsoft.com/office/drawing/2016/5/14/chartex" xmlns:mc="http://schemas.openxmlformats.org/markup-compatibility/2006" xmlns:aink="http://schemas.microsoft.com/office/drawing/2016/ink" xmlns:am3d="http://schemas.microsoft.com/office/drawing/2017/model3d" xmlns:o="urn:schemas-microsoft-com:office:office" xmlns:oel="http://schemas.microsoft.com/office/2019/extlst" xmlns:r="http://schemas.openxmlformats.org/officeDocument/2006/relationships" xmlns:m="http://schemas.openxmlformats.org/officeDocument/2006/math" xmlns:v="urn:schemas-microsoft-com:vml" xmlns:wp14="http://schemas.microsoft.com/office/word/2010/wordprocessingDrawing" xmlns:wp="http://schemas.openxmlformats.org/drawingml/2006/wordprocessingDrawing" xmlns:w10="urn:schemas-microsoft-com:office:word" xmlns:w="http://schemas.openxmlformats.org/wordprocessingml/2006/main" xmlns:w14="http://schemas.microsoft.com/office/word/2010/wordml" xmlns:w15="http://schemas.microsoft.com/office/word/2012/wordml" xmlns:w16cex="http://schemas.microsoft.com/office/word/2018/wordml/cex" xmlns:w16cid="http://schemas.microsoft.com/office/word/2016/wordml/cid" xmlns:w16="http://schemas.microsoft.com/office/word/2018/wordml" xmlns:w16du="http://schemas.microsoft.com/office/word/2023/wordml/word16du" xmlns:w16sdtdh="http://schemas.microsoft.com/office/word/2020/wordml/sdtdatahash" xmlns:w16se="http://schemas.microsoft.com/office/word/2015/wordml/symex" xmlns:wpg="http://schemas.microsoft.com/office/word/2010/wordprocessingGroup" xmlns:wpi="http://schemas.microsoft.com/office/word/2010/wordprocessingInk" xmlns:wne="http://schemas.microsoft.com/office/word/2006/wordml" xmlns:wps="http://schemas.microsoft.com/office/word/2010/wordprocessingShape" mc:Ignorable="w14 w15 w16se w16cid w16 w16cex w16sdtdh w16du wp14">
+<w:hdr xmlns:wpc="http://schemas.microsoft.com/office/word/2010/wordprocessingCanvas" xmlns:cx="http://schemas.microsoft.com/office/drawing/2014/chartex" xmlns:cx1="http://schemas.microsoft.com/office/drawing/2015/9/8/chartex" xmlns:cx2="http://schemas.microsoft.com/office/drawing/2015/10/21/chartex" xmlns:cx3="http://schemas.microsoft.com/office/drawing/2016/5/9/chartex" xmlns:cx4="http://schemas.microsoft.com/office/drawing/2016/5/10/chartex" xmlns:cx5="http://schemas.microsoft.com/office/drawing/2016/5/11/chartex" xmlns:cx6="http://schemas.microsoft.com/office/drawing/2016/5/12/chartex" xmlns:cx7="http://schemas.microsoft.com/office/drawing/2016/5/13/chartex" xmlns:cx8="http://schemas.microsoft.com/office/drawing/2016/5/14/chartex" xmlns:mc="http://schemas.openxmlformats.org/markup-compatibility/2006" xmlns:aink="http://schemas.microsoft.com/office/drawing/2016/ink" xmlns:am3d="http://schemas.microsoft.com/office/drawing/2017/model3d" xmlns:o="urn:schemas-microsoft-com:office:office" xmlns:oel="http://schemas.microsoft.com/office/2019/extlst" xmlns:r="http://schemas.openxmlformats.org/officeDocument/2006/relationships" xmlns:m="http://schemas.openxmlformats.org/officeDocument/2006/math" xmlns:v="urn:schemas-microsoft-com:vml" xmlns:wp14="http://schemas.microsoft.com/office/word/2010/wordprocessingDrawing" xmlns:wp="http://schemas.openxmlformats.org/drawingml/2006/wordprocessingDrawing" xmlns:w10="urn:schemas-microsoft-com:office:word" xmlns:w="http://schemas.openxmlformats.org/wordprocessingml/2006/main" xmlns:w14="http://schemas.microsoft.com/office/word/2010/wordml" xmlns:w15="http://schemas.microsoft.com/office/word/2012/wordml" xmlns:w16cex="http://schemas.microsoft.com/office/word/2018/wordml/cex" xmlns:w16cid="http://schemas.microsoft.com/office/word/2016/wordml/cid" xmlns:w16="http://schemas.microsoft.com/office/word/2018/wordml" xmlns:w16du="http://schemas.microsoft.com/office/word/2023/wordml/word16du" xmlns:w16sdtdh="http://schemas.microsoft.com/office/word/2020/wordml/sdtdatahash" xmlns:w16sdtfl="http://schemas.microsoft.com/office/word/2024/wordml/sdtformatlock" xmlns:w16se="http://schemas.microsoft.com/office/word/2015/wordml/symex" xmlns:wpg="http://schemas.microsoft.com/office/word/2010/wordprocessingGroup" xmlns:wpi="http://schemas.microsoft.com/office/word/2010/wordprocessingInk" xmlns:wne="http://schemas.microsoft.com/office/word/2006/wordml" xmlns:wps="http://schemas.microsoft.com/office/word/2010/wordprocessingShape" mc:Ignorable="w14 w15 w16se w16cid w16 w16cex w16sdtdh w16sdtfl w16du wp14">
   <w:p/>
 </w:hdr>
 </file>
 
 <file path=word/header2.xml><?xml version="1.0" encoding="utf-8"?>
-<w:hdr xmlns:wpc="http://schemas.microsoft.com/office/word/2010/wordprocessingCanvas" xmlns:cx="http://schemas.microsoft.com/office/drawing/2014/chartex" xmlns:cx1="http://schemas.microsoft.com/office/drawing/2015/9/8/chartex" xmlns:cx2="http://schemas.microsoft.com/office/drawing/2015/10/21/chartex" xmlns:cx3="http://schemas.microsoft.com/office/drawing/2016/5/9/chartex" xmlns:cx4="http://schemas.microsoft.com/office/drawing/2016/5/10/chartex" xmlns:cx5="http://schemas.microsoft.com/office/drawing/2016/5/11/chartex" xmlns:cx6="http://schemas.microsoft.com/office/drawing/2016/5/12/chartex" xmlns:cx7="http://schemas.microsoft.com/office/drawing/2016/5/13/chartex" xmlns:cx8="http://schemas.microsoft.com/office/drawing/2016/5/14/chartex" xmlns:mc="http://schemas.openxmlformats.org/markup-compatibility/2006" xmlns:aink="http://schemas.microsoft.com/office/drawing/2016/ink" xmlns:am3d="http://schemas.microsoft.com/office/drawing/2017/model3d" xmlns:o="urn:schemas-microsoft-com:office:office" xmlns:oel="http://schemas.microsoft.com/office/2019/extlst" xmlns:r="http://schemas.openxmlformats.org/officeDocument/2006/relationships" xmlns:m="http://schemas.openxmlformats.org/officeDocument/2006/math" xmlns:v="urn:schemas-microsoft-com:vml" xmlns:wp14="http://schemas.microsoft.com/office/word/2010/wordprocessingDrawing" xmlns:wp="http://schemas.openxmlformats.org/drawingml/2006/wordprocessingDrawing" xmlns:w10="urn:schemas-microsoft-com:office:word" xmlns:w="http://schemas.openxmlformats.org/wordprocessingml/2006/main" xmlns:w14="http://schemas.microsoft.com/office/word/2010/wordml" xmlns:w15="http://schemas.microsoft.com/office/word/2012/wordml" xmlns:w16cex="http://schemas.microsoft.com/office/word/2018/wordml/cex" xmlns:w16cid="http://schemas.microsoft.com/office/word/2016/wordml/cid" xmlns:w16="http://schemas.microsoft.com/office/word/2018/wordml" xmlns:w16du="http://schemas.microsoft.com/office/word/2023/wordml/word16du" xmlns:w16sdtdh="http://schemas.microsoft.com/office/word/2020/wordml/sdtdatahash" xmlns:w16se="http://schemas.microsoft.com/office/word/2015/wordml/symex" xmlns:wpg="http://schemas.microsoft.com/office/word/2010/wordprocessingGroup" xmlns:wpi="http://schemas.microsoft.com/office/word/2010/wordprocessingInk" xmlns:wne="http://schemas.microsoft.com/office/word/2006/wordml" xmlns:wps="http://schemas.microsoft.com/office/word/2010/wordprocessingShape" mc:Ignorable="w14 w15 w16se w16cid w16 w16cex w16sdtdh w16du wp14">
+<w:hdr xmlns:wpc="http://schemas.microsoft.com/office/word/2010/wordprocessingCanvas" xmlns:cx="http://schemas.microsoft.com/office/drawing/2014/chartex" xmlns:cx1="http://schemas.microsoft.com/office/drawing/2015/9/8/chartex" xmlns:cx2="http://schemas.microsoft.com/office/drawing/2015/10/21/chartex" xmlns:cx3="http://schemas.microsoft.com/office/drawing/2016/5/9/chartex" xmlns:cx4="http://schemas.microsoft.com/office/drawing/2016/5/10/chartex" xmlns:cx5="http://schemas.microsoft.com/office/drawing/2016/5/11/chartex" xmlns:cx6="http://schemas.microsoft.com/office/drawing/2016/5/12/chartex" xmlns:cx7="http://schemas.microsoft.com/office/drawing/2016/5/13/chartex" xmlns:cx8="http://schemas.microsoft.com/office/drawing/2016/5/14/chartex" xmlns:mc="http://schemas.openxmlformats.org/markup-compatibility/2006" xmlns:aink="http://schemas.microsoft.com/office/drawing/2016/ink" xmlns:am3d="http://schemas.microsoft.com/office/drawing/2017/model3d" xmlns:o="urn:schemas-microsoft-com:office:office" xmlns:oel="http://schemas.microsoft.com/office/2019/extlst" xmlns:r="http://schemas.openxmlformats.org/officeDocument/2006/relationships" xmlns:m="http://schemas.openxmlformats.org/officeDocument/2006/math" xmlns:v="urn:schemas-microsoft-com:vml" xmlns:wp14="http://schemas.microsoft.com/office/word/2010/wordprocessingDrawing" xmlns:wp="http://schemas.openxmlformats.org/drawingml/2006/wordprocessingDrawing" xmlns:w10="urn:schemas-microsoft-com:office:word" xmlns:w="http://schemas.openxmlformats.org/wordprocessingml/2006/main" xmlns:w14="http://schemas.microsoft.com/office/word/2010/wordml" xmlns:w15="http://schemas.microsoft.com/office/word/2012/wordml" xmlns:w16cex="http://schemas.microsoft.com/office/word/2018/wordml/cex" xmlns:w16cid="http://schemas.microsoft.com/office/word/2016/wordml/cid" xmlns:w16="http://schemas.microsoft.com/office/word/2018/wordml" xmlns:w16du="http://schemas.microsoft.com/office/word/2023/wordml/word16du" xmlns:w16sdtdh="http://schemas.microsoft.com/office/word/2020/wordml/sdtdatahash" xmlns:w16sdtfl="http://schemas.microsoft.com/office/word/2024/wordml/sdtformatlock" xmlns:w16se="http://schemas.microsoft.com/office/word/2015/wordml/symex" xmlns:wpg="http://schemas.microsoft.com/office/word/2010/wordprocessingGroup" xmlns:wpi="http://schemas.microsoft.com/office/word/2010/wordprocessingInk" xmlns:wne="http://schemas.microsoft.com/office/word/2006/wordml" xmlns:wps="http://schemas.microsoft.com/office/word/2010/wordprocessingShape" mc:Ignorable="w14 w15 w16se w16cid w16 w16cex w16sdtdh w16sdtfl w16du wp14">
   <w:p>
     <w:proofErr w:type="spellStart"/>
     <w:r>
@@ -3135,13 +3253,13 @@
 </file>
 
 <file path=word/header3.xml><?xml version="1.0" encoding="utf-8"?>
-<w:hdr xmlns:wpc="http://schemas.microsoft.com/office/word/2010/wordprocessingCanvas" xmlns:cx="http://schemas.microsoft.com/office/drawing/2014/chartex" xmlns:cx1="http://schemas.microsoft.com/office/drawing/2015/9/8/chartex" xmlns:cx2="http://schemas.microsoft.com/office/drawing/2015/10/21/chartex" xmlns:cx3="http://schemas.microsoft.com/office/drawing/2016/5/9/chartex" xmlns:cx4="http://schemas.microsoft.com/office/drawing/2016/5/10/chartex" xmlns:cx5="http://schemas.microsoft.com/office/drawing/2016/5/11/chartex" xmlns:cx6="http://schemas.microsoft.com/office/drawing/2016/5/12/chartex" xmlns:cx7="http://schemas.microsoft.com/office/drawing/2016/5/13/chartex" xmlns:cx8="http://schemas.microsoft.com/office/drawing/2016/5/14/chartex" xmlns:mc="http://schemas.openxmlformats.org/markup-compatibility/2006" xmlns:aink="http://schemas.microsoft.com/office/drawing/2016/ink" xmlns:am3d="http://schemas.microsoft.com/office/drawing/2017/model3d" xmlns:o="urn:schemas-microsoft-com:office:office" xmlns:oel="http://schemas.microsoft.com/office/2019/extlst" xmlns:r="http://schemas.openxmlformats.org/officeDocument/2006/relationships" xmlns:m="http://schemas.openxmlformats.org/officeDocument/2006/math" xmlns:v="urn:schemas-microsoft-com:vml" xmlns:wp14="http://schemas.microsoft.com/office/word/2010/wordprocessingDrawing" xmlns:wp="http://schemas.openxmlformats.org/drawingml/2006/wordprocessingDrawing" xmlns:w10="urn:schemas-microsoft-com:office:word" xmlns:w="http://schemas.openxmlformats.org/wordprocessingml/2006/main" xmlns:w14="http://schemas.microsoft.com/office/word/2010/wordml" xmlns:w15="http://schemas.microsoft.com/office/word/2012/wordml" xmlns:w16cex="http://schemas.microsoft.com/office/word/2018/wordml/cex" xmlns:w16cid="http://schemas.microsoft.com/office/word/2016/wordml/cid" xmlns:w16="http://schemas.microsoft.com/office/word/2018/wordml" xmlns:w16du="http://schemas.microsoft.com/office/word/2023/wordml/word16du" xmlns:w16sdtdh="http://schemas.microsoft.com/office/word/2020/wordml/sdtdatahash" xmlns:w16se="http://schemas.microsoft.com/office/word/2015/wordml/symex" xmlns:wpg="http://schemas.microsoft.com/office/word/2010/wordprocessingGroup" xmlns:wpi="http://schemas.microsoft.com/office/word/2010/wordprocessingInk" xmlns:wne="http://schemas.microsoft.com/office/word/2006/wordml" xmlns:wps="http://schemas.microsoft.com/office/word/2010/wordprocessingShape" mc:Ignorable="w14 w15 w16se w16cid w16 w16cex w16sdtdh w16du wp14">
+<w:hdr xmlns:wpc="http://schemas.microsoft.com/office/word/2010/wordprocessingCanvas" xmlns:cx="http://schemas.microsoft.com/office/drawing/2014/chartex" xmlns:cx1="http://schemas.microsoft.com/office/drawing/2015/9/8/chartex" xmlns:cx2="http://schemas.microsoft.com/office/drawing/2015/10/21/chartex" xmlns:cx3="http://schemas.microsoft.com/office/drawing/2016/5/9/chartex" xmlns:cx4="http://schemas.microsoft.com/office/drawing/2016/5/10/chartex" xmlns:cx5="http://schemas.microsoft.com/office/drawing/2016/5/11/chartex" xmlns:cx6="http://schemas.microsoft.com/office/drawing/2016/5/12/chartex" xmlns:cx7="http://schemas.microsoft.com/office/drawing/2016/5/13/chartex" xmlns:cx8="http://schemas.microsoft.com/office/drawing/2016/5/14/chartex" xmlns:mc="http://schemas.openxmlformats.org/markup-compatibility/2006" xmlns:aink="http://schemas.microsoft.com/office/drawing/2016/ink" xmlns:am3d="http://schemas.microsoft.com/office/drawing/2017/model3d" xmlns:o="urn:schemas-microsoft-com:office:office" xmlns:oel="http://schemas.microsoft.com/office/2019/extlst" xmlns:r="http://schemas.openxmlformats.org/officeDocument/2006/relationships" xmlns:m="http://schemas.openxmlformats.org/officeDocument/2006/math" xmlns:v="urn:schemas-microsoft-com:vml" xmlns:wp14="http://schemas.microsoft.com/office/word/2010/wordprocessingDrawing" xmlns:wp="http://schemas.openxmlformats.org/drawingml/2006/wordprocessingDrawing" xmlns:w10="urn:schemas-microsoft-com:office:word" xmlns:w="http://schemas.openxmlformats.org/wordprocessingml/2006/main" xmlns:w14="http://schemas.microsoft.com/office/word/2010/wordml" xmlns:w15="http://schemas.microsoft.com/office/word/2012/wordml" xmlns:w16cex="http://schemas.microsoft.com/office/word/2018/wordml/cex" xmlns:w16cid="http://schemas.microsoft.com/office/word/2016/wordml/cid" xmlns:w16="http://schemas.microsoft.com/office/word/2018/wordml" xmlns:w16du="http://schemas.microsoft.com/office/word/2023/wordml/word16du" xmlns:w16sdtdh="http://schemas.microsoft.com/office/word/2020/wordml/sdtdatahash" xmlns:w16sdtfl="http://schemas.microsoft.com/office/word/2024/wordml/sdtformatlock" xmlns:w16se="http://schemas.microsoft.com/office/word/2015/wordml/symex" xmlns:wpg="http://schemas.microsoft.com/office/word/2010/wordprocessingGroup" xmlns:wpi="http://schemas.microsoft.com/office/word/2010/wordprocessingInk" xmlns:wne="http://schemas.microsoft.com/office/word/2006/wordml" xmlns:wps="http://schemas.microsoft.com/office/word/2010/wordprocessingShape" mc:Ignorable="w14 w15 w16se w16cid w16 w16cex w16sdtdh w16sdtfl w16du wp14">
   <w:p/>
 </w:hdr>
 </file>
 
 <file path=word/numbering.xml><?xml version="1.0" encoding="utf-8"?>
-<w:numbering xmlns:wpc="http://schemas.microsoft.com/office/word/2010/wordprocessingCanvas" xmlns:cx="http://schemas.microsoft.com/office/drawing/2014/chartex" xmlns:cx1="http://schemas.microsoft.com/office/drawing/2015/9/8/chartex" xmlns:cx2="http://schemas.microsoft.com/office/drawing/2015/10/21/chartex" xmlns:cx3="http://schemas.microsoft.com/office/drawing/2016/5/9/chartex" xmlns:cx4="http://schemas.microsoft.com/office/drawing/2016/5/10/chartex" xmlns:cx5="http://schemas.microsoft.com/office/drawing/2016/5/11/chartex" xmlns:cx6="http://schemas.microsoft.com/office/drawing/2016/5/12/chartex" xmlns:cx7="http://schemas.microsoft.com/office/drawing/2016/5/13/chartex" xmlns:cx8="http://schemas.microsoft.com/office/drawing/2016/5/14/chartex" xmlns:mc="http://schemas.openxmlformats.org/markup-compatibility/2006" xmlns:aink="http://schemas.microsoft.com/office/drawing/2016/ink" xmlns:am3d="http://schemas.microsoft.com/office/drawing/2017/model3d" xmlns:o="urn:schemas-microsoft-com:office:office" xmlns:oel="http://schemas.microsoft.com/office/2019/extlst" xmlns:r="http://schemas.openxmlformats.org/officeDocument/2006/relationships" xmlns:m="http://schemas.openxmlformats.org/officeDocument/2006/math" xmlns:v="urn:schemas-microsoft-com:vml" xmlns:wp14="http://schemas.microsoft.com/office/word/2010/wordprocessingDrawing" xmlns:wp="http://schemas.openxmlformats.org/drawingml/2006/wordprocessingDrawing" xmlns:w10="urn:schemas-microsoft-com:office:word" xmlns:w="http://schemas.openxmlformats.org/wordprocessingml/2006/main" xmlns:w14="http://schemas.microsoft.com/office/word/2010/wordml" xmlns:w15="http://schemas.microsoft.com/office/word/2012/wordml" xmlns:w16cex="http://schemas.microsoft.com/office/word/2018/wordml/cex" xmlns:w16cid="http://schemas.microsoft.com/office/word/2016/wordml/cid" xmlns:w16="http://schemas.microsoft.com/office/word/2018/wordml" xmlns:w16du="http://schemas.microsoft.com/office/word/2023/wordml/word16du" xmlns:w16sdtdh="http://schemas.microsoft.com/office/word/2020/wordml/sdtdatahash" xmlns:w16se="http://schemas.microsoft.com/office/word/2015/wordml/symex" xmlns:wpg="http://schemas.microsoft.com/office/word/2010/wordprocessingGroup" xmlns:wpi="http://schemas.microsoft.com/office/word/2010/wordprocessingInk" xmlns:wne="http://schemas.microsoft.com/office/word/2006/wordml" xmlns:wps="http://schemas.microsoft.com/office/word/2010/wordprocessingShape" mc:Ignorable="w14 w15 w16se w16cid w16 w16cex w16sdtdh w16du wp14">
+<w:numbering xmlns:wpc="http://schemas.microsoft.com/office/word/2010/wordprocessingCanvas" xmlns:cx="http://schemas.microsoft.com/office/drawing/2014/chartex" xmlns:cx1="http://schemas.microsoft.com/office/drawing/2015/9/8/chartex" xmlns:cx2="http://schemas.microsoft.com/office/drawing/2015/10/21/chartex" xmlns:cx3="http://schemas.microsoft.com/office/drawing/2016/5/9/chartex" xmlns:cx4="http://schemas.microsoft.com/office/drawing/2016/5/10/chartex" xmlns:cx5="http://schemas.microsoft.com/office/drawing/2016/5/11/chartex" xmlns:cx6="http://schemas.microsoft.com/office/drawing/2016/5/12/chartex" xmlns:cx7="http://schemas.microsoft.com/office/drawing/2016/5/13/chartex" xmlns:cx8="http://schemas.microsoft.com/office/drawing/2016/5/14/chartex" xmlns:mc="http://schemas.openxmlformats.org/markup-compatibility/2006" xmlns:aink="http://schemas.microsoft.com/office/drawing/2016/ink" xmlns:am3d="http://schemas.microsoft.com/office/drawing/2017/model3d" xmlns:o="urn:schemas-microsoft-com:office:office" xmlns:oel="http://schemas.microsoft.com/office/2019/extlst" xmlns:r="http://schemas.openxmlformats.org/officeDocument/2006/relationships" xmlns:m="http://schemas.openxmlformats.org/officeDocument/2006/math" xmlns:v="urn:schemas-microsoft-com:vml" xmlns:wp14="http://schemas.microsoft.com/office/word/2010/wordprocessingDrawing" xmlns:wp="http://schemas.openxmlformats.org/drawingml/2006/wordprocessingDrawing" xmlns:w10="urn:schemas-microsoft-com:office:word" xmlns:w="http://schemas.openxmlformats.org/wordprocessingml/2006/main" xmlns:w14="http://schemas.microsoft.com/office/word/2010/wordml" xmlns:w15="http://schemas.microsoft.com/office/word/2012/wordml" xmlns:w16cex="http://schemas.microsoft.com/office/word/2018/wordml/cex" xmlns:w16cid="http://schemas.microsoft.com/office/word/2016/wordml/cid" xmlns:w16="http://schemas.microsoft.com/office/word/2018/wordml" xmlns:w16du="http://schemas.microsoft.com/office/word/2023/wordml/word16du" xmlns:w16sdtdh="http://schemas.microsoft.com/office/word/2020/wordml/sdtdatahash" xmlns:w16sdtfl="http://schemas.microsoft.com/office/word/2024/wordml/sdtformatlock" xmlns:w16se="http://schemas.microsoft.com/office/word/2015/wordml/symex" xmlns:wpg="http://schemas.microsoft.com/office/word/2010/wordprocessingGroup" xmlns:wpi="http://schemas.microsoft.com/office/word/2010/wordprocessingInk" xmlns:wne="http://schemas.microsoft.com/office/word/2006/wordml" xmlns:wps="http://schemas.microsoft.com/office/word/2010/wordprocessingShape" mc:Ignorable="w14 w15 w16se w16cid w16 w16cex w16sdtdh w16sdtfl w16du wp14">
   <w:abstractNum w:abstractNumId="0" w15:restartNumberingAfterBreak="0">
     <w:nsid w:val="019D1CF0"/>
     <w:multiLevelType w:val="hybridMultilevel"/>
@@ -3711,7 +3829,7 @@
 </file>
 
 <file path=word/styles.xml><?xml version="1.0" encoding="utf-8"?>
-<w:styles xmlns:mc="http://schemas.openxmlformats.org/markup-compatibility/2006" xmlns:r="http://schemas.openxmlformats.org/officeDocument/2006/relationships" xmlns:w="http://schemas.openxmlformats.org/wordprocessingml/2006/main" xmlns:w14="http://schemas.microsoft.com/office/word/2010/wordml" xmlns:w15="http://schemas.microsoft.com/office/word/2012/wordml" xmlns:w16cex="http://schemas.microsoft.com/office/word/2018/wordml/cex" xmlns:w16cid="http://schemas.microsoft.com/office/word/2016/wordml/cid" xmlns:w16="http://schemas.microsoft.com/office/word/2018/wordml" xmlns:w16du="http://schemas.microsoft.com/office/word/2023/wordml/word16du" xmlns:w16sdtdh="http://schemas.microsoft.com/office/word/2020/wordml/sdtdatahash" xmlns:w16se="http://schemas.microsoft.com/office/word/2015/wordml/symex" mc:Ignorable="w14 w15 w16se w16cid w16 w16cex w16sdtdh w16du">
+<w:styles xmlns:mc="http://schemas.openxmlformats.org/markup-compatibility/2006" xmlns:r="http://schemas.openxmlformats.org/officeDocument/2006/relationships" xmlns:w="http://schemas.openxmlformats.org/wordprocessingml/2006/main" xmlns:w14="http://schemas.microsoft.com/office/word/2010/wordml" xmlns:w15="http://schemas.microsoft.com/office/word/2012/wordml" xmlns:w16cex="http://schemas.microsoft.com/office/word/2018/wordml/cex" xmlns:w16cid="http://schemas.microsoft.com/office/word/2016/wordml/cid" xmlns:w16="http://schemas.microsoft.com/office/word/2018/wordml" xmlns:w16du="http://schemas.microsoft.com/office/word/2023/wordml/word16du" xmlns:w16sdtdh="http://schemas.microsoft.com/office/word/2020/wordml/sdtdatahash" xmlns:w16sdtfl="http://schemas.microsoft.com/office/word/2024/wordml/sdtformatlock" xmlns:w16se="http://schemas.microsoft.com/office/word/2015/wordml/symex" mc:Ignorable="w14 w15 w16se w16cid w16 w16cex w16sdtdh w16sdtfl w16du">
   <w:docDefaults>
     <w:rPrDefault>
       <w:rPr>

</xml_diff>